<commit_message>
Rank importance on calibration split; measure deployed policy; n_jobs=1 for single-CPU serving; enforce training data contract
</commit_message>
<xml_diff>
--- a/reports/submission.docx
+++ b/reports/submission.docx
@@ -302,7 +302,7 @@
         <w:t>The model is 53.8% position-dependent.</w:t>
       </w:r>
       <w:r>
-        <w:t xml:space="preserve"> More than half its predictions change when the two groups are swapped. The two positions are genuinely not exchangeable, so this is defensible signal rather than a defect — but it means the model has partly learned </w:t>
+        <w:t xml:space="preserve"> More than half its predictions fail to transform correctly when the two groups are swapped. The two positions are genuinely not exchangeable, so this is defensible signal rather than a defect — but it means the model has partly learned </w:t>
       </w:r>
       <w:r>
         <w:rPr>
@@ -2406,16 +2406,25 @@
     </w:p>
     <w:p>
       <w:r>
-        <w:t xml:space="preserve">The cost of keeping it is measured: the deployed model's predictions change under a group swap </w:t>
+        <w:t xml:space="preserve">The cost of keeping it is measured: the deployed model </w:t>
       </w:r>
       <w:r>
         <w:rPr>
           <w:b/>
         </w:rPr>
-        <w:t>53.8% of the time</w:t>
-      </w:r>
-      <w:r>
-        <w:t>, so it has partly learned position rather than group characteristics. If the labelling convention changes upstream, it degrades sharply. Stated as a limitation, not presented as robustness.</w:t>
+        <w:t>fails to transform correctly under a group swap 53.8% of the time</w:t>
+      </w:r>
+      <w:r>
+        <w:t xml:space="preserve">. The direction matters — the symmetry requires 0→0, 1→2, 2→1, so for classes 1 and 2 </w:t>
+      </w:r>
+      <w:r>
+        <w:rPr>
+          <w:i/>
+        </w:rPr>
+        <w:t>changing is the correct behaviour</w:t>
+      </w:r>
+      <w:r>
+        <w:t xml:space="preserve"> and staying the same is the violation. So it has partly learned position rather than group characteristics. If the labelling convention changes upstream, it degrades sharply. Stated as a limitation, not presented as robustness.</w:t>
       </w:r>
     </w:p>
     <w:p>
@@ -8654,10 +8663,57 @@
         <w:rPr>
           <w:b/>
         </w:rPr>
-        <w:t>both</w:t>
-      </w:r>
-      <w:r>
-        <w:t xml:space="preserve"> CV macro F1 and business lift.</w:t>
+        <w:t>CV accuracy</w:t>
+      </w:r>
+      <w:r>
+        <w:t xml:space="preserve"> </w:t>
+      </w:r>
+      <w:r>
+        <w:rPr>
+          <w:i/>
+        </w:rPr>
+        <w:t>and</w:t>
+      </w:r>
+      <w:r>
+        <w:t xml:space="preserve"> business lift, </w:t>
+      </w:r>
+      <w:r>
+        <w:rPr>
+          <w:b/>
+        </w:rPr>
+        <w:t>and by more than one fold standard deviation</w:t>
+      </w:r>
+      <w:r>
+        <w:t xml:space="preserve"> — on this data a 0.4-point win is not a win. Accuracy rather than macro F1, because accuracy </w:t>
+      </w:r>
+      <w:r>
+        <w:rPr>
+          <w:i/>
+        </w:rPr>
+        <w:t>is</w:t>
+      </w:r>
+      <w:r>
+        <w:t xml:space="preserve"> the campaign success rate; selecting on macro F1 was tried and chose a model scoring below the naive baseline.</w:t>
+      </w:r>
+    </w:p>
+    <w:p>
+      <w:r>
+        <w:rPr>
+          <w:b/>
+        </w:rPr>
+        <w:t>One monitoring signal deserves separate mention: position-convention drift.</w:t>
+      </w:r>
+      <w:r>
+        <w:t xml:space="preserve"> 53.8% of predictions fail to transform correctly when the two groups are swapped — the model leans heavily on which slot a group occupies. If the upstream convention for assigning "group 1" ever changes, the model degrades sharply and </w:t>
+      </w:r>
+      <w:r>
+        <w:rPr>
+          <w:i/>
+        </w:rPr>
+        <w:t>silently</w:t>
+      </w:r>
+      <w:r>
+        <w:t xml:space="preserve"> — no error, no latency change, no drift in the input marginals, just worse decisions. Tracking the swap-invariance rate on recent traffic is the cheapest guard, and it is the failure mode I would expect to occur before any of the four above.</w:t>
       </w:r>
     </w:p>
     <w:p>
@@ -9592,6 +9648,773 @@
       </w:r>
     </w:p>
     <w:p>
+      <w:r>
+        <w:rPr>
+          <w:b/>
+        </w:rPr>
+        <w:t>Latency.</w:t>
+      </w:r>
+      <w:r>
+        <w:t xml:space="preserve"> All figures below are from </w:t>
+      </w:r>
+      <w:r>
+        <w:rPr>
+          <w:rFonts w:ascii="Consolas" w:hAnsi="Consolas"/>
+          <w:color w:val="B03060"/>
+          <w:sz w:val="19"/>
+        </w:rPr>
+        <w:t>reports/latency.json</w:t>
+      </w:r>
+      <w:r>
+        <w:t xml:space="preserve">, written by </w:t>
+      </w:r>
+      <w:r>
+        <w:rPr>
+          <w:rFonts w:ascii="Consolas" w:hAnsi="Consolas"/>
+          <w:color w:val="B03060"/>
+          <w:sz w:val="19"/>
+        </w:rPr>
+        <w:t>scripts/measure_latency.py</w:t>
+      </w:r>
+      <w:r>
+        <w:t xml:space="preserve"> against the deployed service. They are </w:t>
+      </w:r>
+      <w:r>
+        <w:rPr>
+          <w:b/>
+        </w:rPr>
+        <w:t>client-observed wall-clock times</w:t>
+      </w:r>
+      <w:r>
+        <w:t xml:space="preserve"> — serialisation, internet round trip, queueing, inference and deserialisation together — which is what a caller experiences, not a clean measure of service time.</w:t>
+      </w:r>
+    </w:p>
+    <w:tbl>
+      <w:tblPr>
+        <w:tblStyle w:val="LightGrid-Accent1"/>
+        <w:tblW w:type="auto" w:w="0"/>
+        <w:tblLook w:firstColumn="1" w:firstRow="1" w:lastColumn="0" w:lastRow="0" w:noHBand="0" w:noVBand="1" w:val="04A0"/>
+      </w:tblPr>
+      <w:tblGrid>
+        <w:gridCol w:w="4320"/>
+        <w:gridCol w:w="4320"/>
+      </w:tblGrid>
+      <w:tr>
+        <w:tc>
+          <w:tcPr>
+            <w:tcW w:type="dxa" w:w="4320"/>
+          </w:tcPr>
+          <w:p>
+            <w:r>
+              <w:rPr>
+                <w:b/>
+                <w:sz w:val="18"/>
+              </w:rPr>
+            </w:r>
+            <w:r>
+              <w:rPr>
+                <w:b/>
+                <w:sz w:val="18"/>
+              </w:rPr>
+              <w:t>Median</w:t>
+            </w:r>
+          </w:p>
+        </w:tc>
+        <w:tc>
+          <w:tcPr>
+            <w:tcW w:type="dxa" w:w="4320"/>
+          </w:tcPr>
+          <w:p>
+            <w:r>
+              <w:rPr>
+                <w:b/>
+                <w:sz w:val="18"/>
+              </w:rPr>
+            </w:r>
+            <w:r>
+              <w:rPr>
+                <w:b/>
+                <w:sz w:val="18"/>
+              </w:rPr>
+              <w:t>129 ms</w:t>
+            </w:r>
+          </w:p>
+        </w:tc>
+      </w:tr>
+      <w:tr>
+        <w:tc>
+          <w:tcPr>
+            <w:tcW w:type="dxa" w:w="4320"/>
+          </w:tcPr>
+          <w:p>
+            <w:r>
+              <w:rPr>
+                <w:sz w:val="18"/>
+              </w:rPr>
+            </w:r>
+            <w:r>
+              <w:rPr>
+                <w:sz w:val="18"/>
+              </w:rPr>
+              <w:t>p95</w:t>
+            </w:r>
+          </w:p>
+        </w:tc>
+        <w:tc>
+          <w:tcPr>
+            <w:tcW w:type="dxa" w:w="4320"/>
+          </w:tcPr>
+          <w:p>
+            <w:r>
+              <w:rPr>
+                <w:sz w:val="18"/>
+              </w:rPr>
+            </w:r>
+            <w:r>
+              <w:rPr>
+                <w:b/>
+                <w:sz w:val="18"/>
+              </w:rPr>
+              <w:t>178 ms</w:t>
+            </w:r>
+          </w:p>
+        </w:tc>
+      </w:tr>
+      <w:tr>
+        <w:tc>
+          <w:tcPr>
+            <w:tcW w:type="dxa" w:w="4320"/>
+          </w:tcPr>
+          <w:p>
+            <w:r>
+              <w:rPr>
+                <w:sz w:val="18"/>
+              </w:rPr>
+            </w:r>
+            <w:r>
+              <w:rPr>
+                <w:sz w:val="18"/>
+              </w:rPr>
+              <w:t>p99</w:t>
+            </w:r>
+          </w:p>
+        </w:tc>
+        <w:tc>
+          <w:tcPr>
+            <w:tcW w:type="dxa" w:w="4320"/>
+          </w:tcPr>
+          <w:p>
+            <w:r>
+              <w:rPr>
+                <w:sz w:val="18"/>
+              </w:rPr>
+            </w:r>
+            <w:r>
+              <w:rPr>
+                <w:sz w:val="18"/>
+              </w:rPr>
+              <w:t>211 ms</w:t>
+            </w:r>
+          </w:p>
+        </w:tc>
+      </w:tr>
+      <w:tr>
+        <w:tc>
+          <w:tcPr>
+            <w:tcW w:type="dxa" w:w="4320"/>
+          </w:tcPr>
+          <w:p>
+            <w:r>
+              <w:rPr>
+                <w:sz w:val="18"/>
+              </w:rPr>
+            </w:r>
+            <w:r>
+              <w:rPr>
+                <w:sz w:val="18"/>
+              </w:rPr>
+              <w:t>First request of a warm-instance run</w:t>
+            </w:r>
+          </w:p>
+        </w:tc>
+        <w:tc>
+          <w:tcPr>
+            <w:tcW w:type="dxa" w:w="4320"/>
+          </w:tcPr>
+          <w:p>
+            <w:r>
+              <w:rPr>
+                <w:sz w:val="18"/>
+              </w:rPr>
+            </w:r>
+            <w:r>
+              <w:rPr>
+                <w:sz w:val="18"/>
+              </w:rPr>
+              <w:t>1,207 ms</w:t>
+            </w:r>
+          </w:p>
+        </w:tc>
+      </w:tr>
+    </w:tbl>
+    <w:p/>
+    <w:p>
+      <w:r>
+        <w:rPr>
+          <w:b/>
+        </w:rPr>
+        <w:t>On cold start, and why this figure is reported with a caveat rather than a number.</w:t>
+      </w:r>
+      <w:r>
+        <w:t xml:space="preserve"> The service scales to zero, so the first request after an idle period pays container start plus deserialisation of the </w:t>
+      </w:r>
+      <w:r>
+        <w:rPr>
+          <w:b/>
+        </w:rPr>
+        <w:t>47 MB</w:t>
+      </w:r>
+      <w:r>
+        <w:t xml:space="preserve"> artifact. A single earlier observation against a genuinely cold container recorded roughly 15 seconds. That measurement is </w:t>
+      </w:r>
+      <w:r>
+        <w:rPr>
+          <w:b/>
+        </w:rPr>
+        <w:t>not reproducible on demand</w:t>
+      </w:r>
+      <w:r>
+        <w:t xml:space="preserve"> — Cloud Run keeps an instance warm for an unpredictable period, so a run that happens to reach a live instance measures something else entirely, as the 1,207 ms figure above shows.</w:t>
+      </w:r>
+    </w:p>
+    <w:p>
+      <w:r>
+        <w:t xml:space="preserve">The honest statement is therefore: </w:t>
+      </w:r>
+      <w:r>
+        <w:rPr>
+          <w:b/>
+        </w:rPr>
+        <w:t>steady-state p95 is 178 ms; cold start is of the order of seconds and has been observed once at ~15 s, but the project does not have a repeatable measurement of it.</w:t>
+      </w:r>
+      <w:r>
+        <w:t xml:space="preserve"> An earlier version of this report quoted 15 s and 91 ms as though both were established, while </w:t>
+      </w:r>
+      <w:r>
+        <w:rPr>
+          <w:rFonts w:ascii="Consolas" w:hAnsi="Consolas"/>
+          <w:color w:val="B03060"/>
+          <w:sz w:val="19"/>
+        </w:rPr>
+        <w:t>latency.json</w:t>
+      </w:r>
+      <w:r>
+        <w:t xml:space="preserve"> recorded different values — a discrepancy a reviewer found before I did.</w:t>
+      </w:r>
+    </w:p>
+    <w:p>
+      <w:r>
+        <w:t xml:space="preserve">Three mitigations exist and none was applied: raise </w:t>
+      </w:r>
+      <w:r>
+        <w:rPr>
+          <w:rFonts w:ascii="Consolas" w:hAnsi="Consolas"/>
+          <w:color w:val="B03060"/>
+          <w:sz w:val="19"/>
+        </w:rPr>
+        <w:t>min_samples_leaf</w:t>
+      </w:r>
+      <w:r>
+        <w:t xml:space="preserve">, reduce </w:t>
+      </w:r>
+      <w:r>
+        <w:rPr>
+          <w:rFonts w:ascii="Consolas" w:hAnsi="Consolas"/>
+          <w:color w:val="B03060"/>
+          <w:sz w:val="19"/>
+        </w:rPr>
+        <w:t>n_estimators</w:t>
+      </w:r>
+      <w:r>
+        <w:t xml:space="preserve">, or serialise with </w:t>
+      </w:r>
+      <w:r>
+        <w:rPr>
+          <w:rFonts w:ascii="Consolas" w:hAnsi="Consolas"/>
+          <w:color w:val="B03060"/>
+          <w:sz w:val="19"/>
+        </w:rPr>
+        <w:t>joblib.dump(compress=3)</w:t>
+      </w:r>
+      <w:r>
+        <w:t xml:space="preserve">. Each changes either the model or the artifact and therefore every number in this report. For campaign planning — scheduled, human-in-the-loop — a slow first request is tolerable; for interactive use the answer is </w:t>
+      </w:r>
+      <w:r>
+        <w:rPr>
+          <w:rFonts w:ascii="Consolas" w:hAnsi="Consolas"/>
+          <w:color w:val="B03060"/>
+          <w:sz w:val="19"/>
+        </w:rPr>
+        <w:t>min-instances=1</w:t>
+      </w:r>
+      <w:r>
+        <w:t>, which costs money continuously and is a business decision.</w:t>
+      </w:r>
+    </w:p>
+    <w:p>
+      <w:r>
+        <w:t xml:space="preserve">Three fixes exist and none was applied: raise </w:t>
+      </w:r>
+      <w:r>
+        <w:rPr>
+          <w:rFonts w:ascii="Consolas" w:hAnsi="Consolas"/>
+          <w:color w:val="B03060"/>
+          <w:sz w:val="19"/>
+        </w:rPr>
+        <w:t>min_samples_leaf</w:t>
+      </w:r>
+      <w:r>
+        <w:t xml:space="preserve">, reduce </w:t>
+      </w:r>
+      <w:r>
+        <w:rPr>
+          <w:rFonts w:ascii="Consolas" w:hAnsi="Consolas"/>
+          <w:color w:val="B03060"/>
+          <w:sz w:val="19"/>
+        </w:rPr>
+        <w:t>n_estimators</w:t>
+      </w:r>
+      <w:r>
+        <w:t xml:space="preserve">, or serialise with </w:t>
+      </w:r>
+      <w:r>
+        <w:rPr>
+          <w:rFonts w:ascii="Consolas" w:hAnsi="Consolas"/>
+          <w:color w:val="B03060"/>
+          <w:sz w:val="19"/>
+        </w:rPr>
+        <w:t>joblib.dump(compress=3)</w:t>
+      </w:r>
+      <w:r>
+        <w:t xml:space="preserve">. Each changes either the model or the artifact, and therefore every number in this report. For campaign planning — a scheduled, human-in-the-loop activity — a 15-second first request is tolerable. For interactive use it is not, and the answer is </w:t>
+      </w:r>
+      <w:r>
+        <w:rPr>
+          <w:rFonts w:ascii="Consolas" w:hAnsi="Consolas"/>
+          <w:color w:val="B03060"/>
+          <w:sz w:val="19"/>
+        </w:rPr>
+        <w:t>min-instances=1</w:t>
+      </w:r>
+      <w:r>
+        <w:t>, which costs money continuously and is a business decision rather than an engineering one.</w:t>
+      </w:r>
+    </w:p>
+    <w:p>
+      <w:pPr>
+        <w:pStyle w:val="Heading4"/>
+      </w:pPr>
+      <w:r>
+        <w:t>7.4 Input validation, authentication and rate limiting</w:t>
+      </w:r>
+    </w:p>
+    <w:p>
+      <w:r>
+        <w:rPr>
+          <w:b/>
+        </w:rPr>
+        <w:t>Validation is enforced; the perimeter is documented.</w:t>
+      </w:r>
+      <w:r>
+        <w:t xml:space="preserve"> The distinction is deliberate.</w:t>
+      </w:r>
+    </w:p>
+    <w:p>
+      <w:r>
+        <w:t xml:space="preserve">The Pydantic schema rejects, with </w:t>
+      </w:r>
+      <w:r>
+        <w:rPr>
+          <w:rFonts w:ascii="Consolas" w:hAnsi="Consolas"/>
+          <w:color w:val="B03060"/>
+          <w:sz w:val="19"/>
+        </w:rPr>
+        <w:t>422</w:t>
+      </w:r>
+      <w:r>
+        <w:t xml:space="preserve"> and a reason:</w:t>
+      </w:r>
+    </w:p>
+    <w:tbl>
+      <w:tblPr>
+        <w:tblStyle w:val="LightGrid-Accent1"/>
+        <w:tblW w:type="auto" w:w="0"/>
+        <w:tblLook w:firstColumn="1" w:firstRow="1" w:lastColumn="0" w:lastRow="0" w:noHBand="0" w:noVBand="1" w:val="04A0"/>
+      </w:tblPr>
+      <w:tblGrid>
+        <w:gridCol w:w="2160"/>
+        <w:gridCol w:w="2160"/>
+        <w:gridCol w:w="2160"/>
+        <w:gridCol w:w="2160"/>
+      </w:tblGrid>
+      <w:tr>
+        <w:tc>
+          <w:tcPr>
+            <w:tcW w:type="dxa" w:w="2160"/>
+          </w:tcPr>
+          <w:p>
+            <w:r>
+              <w:rPr>
+                <w:b/>
+                <w:sz w:val="18"/>
+              </w:rPr>
+            </w:r>
+            <w:r>
+              <w:rPr>
+                <w:b/>
+                <w:sz w:val="18"/>
+              </w:rPr>
+              <w:t>Input</w:t>
+            </w:r>
+          </w:p>
+        </w:tc>
+        <w:tc>
+          <w:tcPr>
+            <w:tcW w:type="dxa" w:w="2160"/>
+          </w:tcPr>
+          <w:p>
+            <w:r>
+              <w:rPr>
+                <w:b/>
+                <w:sz w:val="18"/>
+              </w:rPr>
+            </w:r>
+            <w:r>
+              <w:rPr>
+                <w:b/>
+                <w:sz w:val="18"/>
+              </w:rPr>
+              <w:t>Why it is refused</w:t>
+            </w:r>
+          </w:p>
+        </w:tc>
+        <w:tc>
+          <w:tcPr>
+            <w:tcW w:type="dxa" w:w="2160"/>
+          </w:tcPr>
+          <w:p>
+            <w:r>
+              <w:rPr>
+                <w:b/>
+                <w:sz w:val="18"/>
+              </w:rPr>
+            </w:r>
+          </w:p>
+        </w:tc>
+        <w:tc>
+          <w:tcPr>
+            <w:tcW w:type="dxa" w:w="2160"/>
+          </w:tcPr>
+          <w:p>
+            <w:r>
+              <w:rPr>
+                <w:b/>
+                <w:sz w:val="18"/>
+              </w:rPr>
+            </w:r>
+          </w:p>
+        </w:tc>
+      </w:tr>
+      <w:tr>
+        <w:tc>
+          <w:tcPr>
+            <w:tcW w:type="dxa" w:w="2160"/>
+          </w:tcPr>
+          <w:p>
+            <w:r>
+              <w:rPr>
+                <w:sz w:val="18"/>
+              </w:rPr>
+            </w:r>
+            <w:r>
+              <w:rPr>
+                <w:rFonts w:ascii="Consolas" w:hAnsi="Consolas"/>
+                <w:color w:val="B03060"/>
+                <w:sz w:val="18"/>
+              </w:rPr>
+              <w:t>NaN</w:t>
+            </w:r>
+          </w:p>
+        </w:tc>
+        <w:tc>
+          <w:tcPr>
+            <w:tcW w:type="dxa" w:w="2160"/>
+          </w:tcPr>
+          <w:p>
+            <w:r>
+              <w:rPr>
+                <w:sz w:val="18"/>
+              </w:rPr>
+            </w:r>
+            <w:r>
+              <w:rPr>
+                <w:sz w:val="18"/>
+              </w:rPr>
+              <w:t>Indistinguishable from null downstream but arrives by a different path — usually a failed upstream computation. A caller should have one deliberate way to say "no value"</w:t>
+            </w:r>
+          </w:p>
+        </w:tc>
+        <w:tc>
+          <w:tcPr>
+            <w:tcW w:type="dxa" w:w="2160"/>
+          </w:tcPr>
+          <w:p>
+            <w:r>
+              <w:rPr>
+                <w:sz w:val="18"/>
+              </w:rPr>
+            </w:r>
+          </w:p>
+        </w:tc>
+        <w:tc>
+          <w:tcPr>
+            <w:tcW w:type="dxa" w:w="2160"/>
+          </w:tcPr>
+          <w:p>
+            <w:r>
+              <w:rPr>
+                <w:sz w:val="18"/>
+              </w:rPr>
+            </w:r>
+          </w:p>
+        </w:tc>
+      </w:tr>
+      <w:tr>
+        <w:tc>
+          <w:tcPr>
+            <w:tcW w:type="dxa" w:w="2160"/>
+          </w:tcPr>
+          <w:p>
+            <w:r>
+              <w:rPr>
+                <w:sz w:val="18"/>
+              </w:rPr>
+            </w:r>
+            <w:r>
+              <w:rPr>
+                <w:rFonts w:ascii="Consolas" w:hAnsi="Consolas"/>
+                <w:color w:val="B03060"/>
+                <w:sz w:val="18"/>
+              </w:rPr>
+              <w:t>±inf</w:t>
+            </w:r>
+            <w:r>
+              <w:rPr>
+                <w:sz w:val="18"/>
+              </w:rPr>
+              <w:t>, `\</w:t>
+            </w:r>
+          </w:p>
+        </w:tc>
+        <w:tc>
+          <w:tcPr>
+            <w:tcW w:type="dxa" w:w="2160"/>
+          </w:tcPr>
+          <w:p>
+            <w:r>
+              <w:rPr>
+                <w:sz w:val="18"/>
+              </w:rPr>
+            </w:r>
+            <w:r>
+              <w:rPr>
+                <w:sz w:val="18"/>
+              </w:rPr>
+              <w:t>value\</w:t>
+            </w:r>
+          </w:p>
+        </w:tc>
+        <w:tc>
+          <w:tcPr>
+            <w:tcW w:type="dxa" w:w="2160"/>
+          </w:tcPr>
+          <w:p>
+            <w:r>
+              <w:rPr>
+                <w:sz w:val="18"/>
+              </w:rPr>
+            </w:r>
+            <w:r>
+              <w:rPr>
+                <w:sz w:val="18"/>
+              </w:rPr>
+              <w:t>&gt; 1e6`</w:t>
+            </w:r>
+          </w:p>
+        </w:tc>
+        <w:tc>
+          <w:tcPr>
+            <w:tcW w:type="dxa" w:w="2160"/>
+          </w:tcPr>
+          <w:p>
+            <w:r>
+              <w:rPr>
+                <w:sz w:val="18"/>
+              </w:rPr>
+            </w:r>
+            <w:r>
+              <w:rPr>
+                <w:sz w:val="18"/>
+              </w:rPr>
+              <w:t xml:space="preserve">Finite-but-implausible values pass every type check and overflow during standardisation. The caller then receives a </w:t>
+            </w:r>
+            <w:r>
+              <w:rPr>
+                <w:rFonts w:ascii="Consolas" w:hAnsi="Consolas"/>
+                <w:color w:val="B03060"/>
+                <w:sz w:val="18"/>
+              </w:rPr>
+              <w:t>500</w:t>
+            </w:r>
+            <w:r>
+              <w:rPr>
+                <w:sz w:val="18"/>
+              </w:rPr>
+              <w:t xml:space="preserve"> for what is unambiguously a client error</w:t>
+            </w:r>
+          </w:p>
+        </w:tc>
+      </w:tr>
+      <w:tr>
+        <w:tc>
+          <w:tcPr>
+            <w:tcW w:type="dxa" w:w="2160"/>
+          </w:tcPr>
+          <w:p>
+            <w:r>
+              <w:rPr>
+                <w:sz w:val="18"/>
+              </w:rPr>
+            </w:r>
+            <w:r>
+              <w:rPr>
+                <w:sz w:val="18"/>
+              </w:rPr>
+              <w:t>More than 20% of features null</w:t>
+            </w:r>
+          </w:p>
+        </w:tc>
+        <w:tc>
+          <w:tcPr>
+            <w:tcW w:type="dxa" w:w="2160"/>
+          </w:tcPr>
+          <w:p>
+            <w:r>
+              <w:rPr>
+                <w:sz w:val="18"/>
+              </w:rPr>
+            </w:r>
+            <w:r>
+              <w:rPr>
+                <w:sz w:val="18"/>
+              </w:rPr>
+              <w:t xml:space="preserve">The median imputer fills every gap confidently, so a request of 67 nulls previously returned a well-formed prediction with a confidence score, built entirely from training medians. </w:t>
+            </w:r>
+            <w:r>
+              <w:rPr>
+                <w:b/>
+                <w:sz w:val="18"/>
+              </w:rPr>
+              <w:t>A campaign must never be approved from an empty request</w:t>
+            </w:r>
+          </w:p>
+        </w:tc>
+        <w:tc>
+          <w:tcPr>
+            <w:tcW w:type="dxa" w:w="2160"/>
+          </w:tcPr>
+          <w:p>
+            <w:r>
+              <w:rPr>
+                <w:sz w:val="18"/>
+              </w:rPr>
+            </w:r>
+          </w:p>
+        </w:tc>
+        <w:tc>
+          <w:tcPr>
+            <w:tcW w:type="dxa" w:w="2160"/>
+          </w:tcPr>
+          <w:p>
+            <w:r>
+              <w:rPr>
+                <w:sz w:val="18"/>
+              </w:rPr>
+            </w:r>
+          </w:p>
+        </w:tc>
+      </w:tr>
+    </w:tbl>
+    <w:p/>
+    <w:p>
+      <w:r>
+        <w:t>These are correctness properties, not perimeter ones, which is why they are in the application rather than deferred to a gateway. No amount of authentication would have prevented an authorised caller from submitting an empty payload and receiving a budget-allocating recommendation.</w:t>
+      </w:r>
+    </w:p>
+    <w:p>
+      <w:r>
+        <w:rPr>
+          <w:b/>
+        </w:rPr>
+        <w:t>Authentication and rate limiting are not implemented, and that is a submission decision.</w:t>
+      </w:r>
+      <w:r>
+        <w:t xml:space="preserve"> The service is unauthenticated so it can be evaluated by opening a URL; handing credentials to three reviewers by email is worse practice than the exposure it prevents, and the payload contains no personal data. Production would remove </w:t>
+      </w:r>
+      <w:r>
+        <w:rPr>
+          <w:rFonts w:ascii="Consolas" w:hAnsi="Consolas"/>
+          <w:color w:val="B03060"/>
+          <w:sz w:val="19"/>
+        </w:rPr>
+        <w:t>--allow-unauthenticated</w:t>
+      </w:r>
+      <w:r>
+        <w:t xml:space="preserve"> (a two-line Terraform change, caller holding </w:t>
+      </w:r>
+      <w:r>
+        <w:rPr>
+          <w:rFonts w:ascii="Consolas" w:hAnsi="Consolas"/>
+          <w:color w:val="B03060"/>
+          <w:sz w:val="19"/>
+        </w:rPr>
+        <w:t>roles/run.invoker</w:t>
+      </w:r>
+      <w:r>
+        <w:t xml:space="preserve">) and rate-limit at Cloud Armor rather than in-process — an in-process limiter on a scale-to-zero service limits </w:t>
+      </w:r>
+      <w:r>
+        <w:rPr>
+          <w:i/>
+        </w:rPr>
+        <w:t>per instance</w:t>
+      </w:r>
+      <w:r>
+        <w:t xml:space="preserve">, so the effective global ceiling rises exactly when a ceiling is needed. See </w:t>
+      </w:r>
+      <w:r>
+        <w:rPr>
+          <w:rFonts w:ascii="Consolas" w:hAnsi="Consolas"/>
+          <w:color w:val="B03060"/>
+          <w:sz w:val="19"/>
+        </w:rPr>
+        <w:t>docs/architecture.md</w:t>
+      </w:r>
+      <w:r>
+        <w:t>.</w:t>
+      </w:r>
+    </w:p>
+    <w:p>
       <w:pPr>
         <w:pStyle w:val="Heading3"/>
       </w:pPr>
@@ -9669,12 +10492,52 @@
         <w:t>The model is 53.8% position-dependent.</w:t>
       </w:r>
       <w:r>
-        <w:t xml:space="preserve"> Its predictions change under a group swap more</w:t>
-      </w:r>
-    </w:p>
-    <w:p>
-      <w:r>
-        <w:t>often than not. This is defensible — the positional prior is real and is the strongest naive baseline — but the model has partly learned which slot a group occupies, and would degrade sharply if that convention changed upstream.</w:t>
+        <w:t xml:space="preserve"> Its predictions fail to transform correctly</w:t>
+      </w:r>
+    </w:p>
+    <w:p>
+      <w:r>
+        <w:t xml:space="preserve">under a group swap more often than not — the symmetry requires 0→0, 1→2, 2→1, so for classes 1 and 2 </w:t>
+      </w:r>
+      <w:r>
+        <w:rPr>
+          <w:i/>
+        </w:rPr>
+        <w:t>not</w:t>
+      </w:r>
+      <w:r>
+        <w:t xml:space="preserve"> changing is the failure. This is defensible: the positional prior is real and is the strongest naive baseline. But the model has partly learned which slot a group occupies, and would degrade sharply if that convention changed upstream.</w:t>
+      </w:r>
+    </w:p>
+    <w:p>
+      <w:r>
+        <w:rPr>
+          <w:b/>
+        </w:rPr>
+        <w:t>Two caveats on this diagnostic itself.</w:t>
+      </w:r>
+      <w:r>
+        <w:t xml:space="preserve"> The mirror transformation for the </w:t>
+      </w:r>
+      <w:r>
+        <w:rPr>
+          <w:rFonts w:ascii="Consolas" w:hAnsi="Consolas"/>
+          <w:color w:val="B03060"/>
+          <w:sz w:val="19"/>
+        </w:rPr>
+        <w:t>c_</w:t>
+      </w:r>
+      <w:r>
+        <w:t xml:space="preserve"> block is heuristic — it infers which comparison features are direction-dependent from their distributions — and it demonstrably </w:t>
+      </w:r>
+      <w:r>
+        <w:rPr>
+          <w:b/>
+        </w:rPr>
+        <w:t>failed on `c_2`</w:t>
+      </w:r>
+      <w:r>
+        <w:t>, the single most predictive feature. So the 53.8% figure is measured against an imperfect mirror, and should be read as evidence that position matters rather than as a precise quantity.</w:t>
       </w:r>
     </w:p>
     <w:p>
@@ -13764,6 +14627,35 @@
         <w:t>Which group is labelled "1" would be arbitrary if the positions were exchangeable. They are not (§3), so the model legitimately uses position — but it uses it heavily:</w:t>
       </w:r>
     </w:p>
+    <w:p>
+      <w:r>
+        <w:rPr>
+          <w:b/>
+        </w:rPr>
+        <w:t>Read the direction carefully.</w:t>
+      </w:r>
+      <w:r>
+        <w:t xml:space="preserve"> Exchanging the two groups should map the prediction 0→0, 1→2, 2→1. A </w:t>
+      </w:r>
+      <w:r>
+        <w:rPr>
+          <w:i/>
+        </w:rPr>
+        <w:t>violation</w:t>
+      </w:r>
+      <w:r>
+        <w:t xml:space="preserve"> is a failure to make that transformation — so for classes 1 and 2 </w:t>
+      </w:r>
+      <w:r>
+        <w:rPr>
+          <w:b/>
+        </w:rPr>
+        <w:t>changing is the correct behaviour</w:t>
+      </w:r>
+      <w:r>
+        <w:t xml:space="preserve"> and staying the same is the fault. Describing this figure as "predictions that change under a swap" states the opposite of what is measured.</w:t>
+      </w:r>
+    </w:p>
     <w:tbl>
       <w:tblPr>
         <w:tblStyle w:val="LightGrid-Accent1"/>
@@ -13791,7 +14683,21 @@
                 <w:b/>
                 <w:sz w:val="18"/>
               </w:rPr>
-              <w:t>Predictions that change under a group swap</w:t>
+              <w:t xml:space="preserve">Predictions that </w:t>
+            </w:r>
+            <w:r>
+              <w:rPr>
+                <w:b/>
+                <w:sz w:val="18"/>
+              </w:rPr>
+              <w:t>fail to transform correctly</w:t>
+            </w:r>
+            <w:r>
+              <w:rPr>
+                <w:b/>
+                <w:sz w:val="18"/>
+              </w:rPr>
+              <w:t xml:space="preserve"> under a group swap</w:t>
             </w:r>
           </w:p>
         </w:tc>
@@ -13812,6 +14718,44 @@
                 <w:sz w:val="18"/>
               </w:rPr>
               <w:t>53.8%</w:t>
+            </w:r>
+          </w:p>
+        </w:tc>
+      </w:tr>
+      <w:tr>
+        <w:tc>
+          <w:tcPr>
+            <w:tcW w:type="dxa" w:w="4320"/>
+          </w:tcPr>
+          <w:p>
+            <w:r>
+              <w:rPr>
+                <w:sz w:val="18"/>
+              </w:rPr>
+            </w:r>
+            <w:r>
+              <w:rPr>
+                <w:sz w:val="18"/>
+              </w:rPr>
+              <w:t>Class-0 predictions that correctly stayed class 0</w:t>
+            </w:r>
+          </w:p>
+        </w:tc>
+        <w:tc>
+          <w:tcPr>
+            <w:tcW w:type="dxa" w:w="4320"/>
+          </w:tcPr>
+          <w:p>
+            <w:r>
+              <w:rPr>
+                <w:sz w:val="18"/>
+              </w:rPr>
+            </w:r>
+            <w:r>
+              <w:rPr>
+                <w:sz w:val="18"/>
+              </w:rPr>
+              <w:t>75.2%</w:t>
             </w:r>
           </w:p>
         </w:tc>
@@ -15330,7 +16274,27 @@
     </w:p>
     <w:p>
       <w:r>
-        <w:t>(measured: p95 91 ms) and a straightforward permutation-importance explanation story.</w:t>
+        <w:t xml:space="preserve">(measured: </w:t>
+      </w:r>
+      <w:r>
+        <w:rPr>
+          <w:b/>
+        </w:rPr>
+        <w:t>p95 178 ms</w:t>
+      </w:r>
+      <w:r>
+        <w:t xml:space="preserve">, median 129 ms — </w:t>
+      </w:r>
+      <w:r>
+        <w:rPr>
+          <w:rFonts w:ascii="Consolas" w:hAnsi="Consolas"/>
+          <w:color w:val="B03060"/>
+          <w:sz w:val="19"/>
+        </w:rPr>
+        <w:t>reports/latency.json</w:t>
+      </w:r>
+      <w:r>
+        <w:t>) and a straightforward permutation-importance explanation story.</w:t>
       </w:r>
     </w:p>
     <w:p>
@@ -16571,45 +17535,41 @@
         <w:pStyle w:val="Heading4"/>
       </w:pPr>
       <w:r>
-        <w:t>Translating into money</w:t>
-      </w:r>
-    </w:p>
-    <w:p>
-      <w:r>
-        <w:t xml:space="preserve">With </w:t>
-      </w:r>
-      <w:r>
-        <w:rPr>
-          <w:rFonts w:ascii="Consolas" w:hAnsi="Consolas"/>
-          <w:color w:val="B03060"/>
-          <w:sz w:val="19"/>
-        </w:rPr>
-        <w:t>C</w:t>
-      </w:r>
-      <w:r>
-        <w:t xml:space="preserve"> campaigns per year at average spend </w:t>
-      </w:r>
-      <w:r>
-        <w:rPr>
-          <w:rFonts w:ascii="Consolas" w:hAnsi="Consolas"/>
-          <w:color w:val="B03060"/>
-          <w:sz w:val="19"/>
-        </w:rPr>
-        <w:t>S</w:t>
-      </w:r>
-      <w:r>
-        <w:t xml:space="preserve"> and average return </w:t>
-      </w:r>
-      <w:r>
-        <w:rPr>
-          <w:rFonts w:ascii="Consolas" w:hAnsi="Consolas"/>
-          <w:color w:val="B03060"/>
-          <w:sz w:val="19"/>
-        </w:rPr>
-        <w:t>R</w:t>
-      </w:r>
-      <w:r>
-        <w:t xml:space="preserve"> on a correctly targeted campaign:</w:t>
+        <w:t>Why there is no euro figure here</w:t>
+      </w:r>
+    </w:p>
+    <w:p>
+      <w:r>
+        <w:t xml:space="preserve">The brief asks for the improvement in </w:t>
+      </w:r>
+      <w:r>
+        <w:rPr>
+          <w:b/>
+        </w:rPr>
+        <w:t>campaign success rate</w:t>
+      </w:r>
+      <w:r>
+        <w:t xml:space="preserve">, and that is answered directly above: </w:t>
+      </w:r>
+      <w:r>
+        <w:rPr>
+          <w:b/>
+        </w:rPr>
+        <w:t>46.45% → 54.83%, a lift of +8.38 pp</w:t>
+      </w:r>
+      <w:r>
+        <w:t>. It does not ask for a monetary estimate, and the dataset contains no monetary values from which one could be derived.</w:t>
+      </w:r>
+    </w:p>
+    <w:p>
+      <w:r>
+        <w:rPr>
+          <w:b/>
+        </w:rPr>
+        <w:t>An earlier version of this document did attempt one, and it was wrong twice over.</w:t>
+      </w:r>
+      <w:r>
+        <w:t xml:space="preserve"> It proposed:</w:t>
       </w:r>
     </w:p>
     <w:p>
@@ -16622,14 +17582,23 @@
           <w:rFonts w:ascii="Consolas" w:hAnsi="Consolas"/>
           <w:sz w:val="18"/>
         </w:rPr>
-        <w:t>Additional value = C x (lift_pp / 100) x R          # better targeting</w:t>
+        <w:t>Additional value = C × (lift_pp / 100) × R      # better targeting</w:t>
         <w:br/>
-        <w:t xml:space="preserve">                 + C x P(class 0) x avoidance_rate x S   # avoided waste</w:t>
-      </w:r>
-    </w:p>
-    <w:p>
-      <w:r>
-        <w:t xml:space="preserve">State the assumed </w:t>
+        <w:t xml:space="preserve">                 + C × P(class 0) × avoidance_rate × S   # avoided waste</w:t>
+      </w:r>
+    </w:p>
+    <w:p>
+      <w:r>
+        <w:t xml:space="preserve">The first term </w:t>
+      </w:r>
+      <w:r>
+        <w:rPr>
+          <w:b/>
+        </w:rPr>
+        <w:t>already contains the second</w:t>
+      </w:r>
+      <w:r>
+        <w:t xml:space="preserve">. </w:t>
       </w:r>
       <w:r>
         <w:rPr>
@@ -16637,10 +17606,24 @@
           <w:color w:val="B03060"/>
           <w:sz w:val="19"/>
         </w:rPr>
-        <w:t>C</w:t>
-      </w:r>
-      <w:r>
-        <w:t xml:space="preserve">, </w:t>
+        <w:t>lift_pp</w:t>
+      </w:r>
+      <w:r>
+        <w:t xml:space="preserve"> is a difference in </w:t>
+      </w:r>
+      <w:r>
+        <w:rPr>
+          <w:i/>
+        </w:rPr>
+        <w:t>accuracy</w:t>
+      </w:r>
+      <w:r>
+        <w:t>, and accuracy counts every correct decision — including correctly predicting class 0. So avoided campaigns are counted once inside the accuracy lift and again in the second term, at a different price. The formula inflates the business case, and it does so in the direction that flatters the model.</w:t>
+      </w:r>
+    </w:p>
+    <w:p>
+      <w:r>
+        <w:t xml:space="preserve">It also required </w:t>
       </w:r>
       <w:r>
         <w:rPr>
@@ -16648,10 +17631,10 @@
           <w:color w:val="B03060"/>
           <w:sz w:val="19"/>
         </w:rPr>
-        <w:t>S</w:t>
-      </w:r>
-      <w:r>
-        <w:t xml:space="preserve"> and </w:t>
+        <w:t>C</w:t>
+      </w:r>
+      <w:r>
+        <w:t xml:space="preserve">, </w:t>
       </w:r>
       <w:r>
         <w:rPr>
@@ -16659,10 +17642,387 @@
           <w:color w:val="B03060"/>
           <w:sz w:val="19"/>
         </w:rPr>
+        <w:t>S</w:t>
+      </w:r>
+      <w:r>
+        <w:t xml:space="preserve"> and </w:t>
+      </w:r>
+      <w:r>
+        <w:rPr>
+          <w:rFonts w:ascii="Consolas" w:hAnsi="Consolas"/>
+          <w:color w:val="B03060"/>
+          <w:sz w:val="19"/>
+        </w:rPr>
         <w:t>R</w:t>
       </w:r>
       <w:r>
-        <w:t xml:space="preserve"> explicitly in the report — the point is the method, not a precise euro figure.</w:t>
+        <w:t xml:space="preserve"> — none of which exist in the data — so the output would have been an arithmetic error dressed in invented inputs.</w:t>
+      </w:r>
+    </w:p>
+    <w:p>
+      <w:r>
+        <w:rPr>
+          <w:b/>
+        </w:rPr>
+        <w:t>What a correct valuation would require.</w:t>
+      </w:r>
+      <w:r>
+        <w:t xml:space="preserve"> Not two additive terms, but the </w:t>
+      </w:r>
+      <w:r>
+        <w:rPr>
+          <w:b/>
+        </w:rPr>
+        <w:t>full 3×3 action/outcome matrix</w:t>
+      </w:r>
+      <w:r>
+        <w:t>, valued state by state:</w:t>
+      </w:r>
+    </w:p>
+    <w:tbl>
+      <w:tblPr>
+        <w:tblStyle w:val="LightGrid-Accent1"/>
+        <w:tblW w:type="auto" w:w="0"/>
+        <w:tblLook w:firstColumn="1" w:firstRow="1" w:lastColumn="0" w:lastRow="0" w:noHBand="0" w:noVBand="1" w:val="04A0"/>
+      </w:tblPr>
+      <w:tblGrid>
+        <w:gridCol w:w="2160"/>
+        <w:gridCol w:w="2160"/>
+        <w:gridCol w:w="2160"/>
+        <w:gridCol w:w="2160"/>
+      </w:tblGrid>
+      <w:tr>
+        <w:tc>
+          <w:tcPr>
+            <w:tcW w:type="dxa" w:w="2160"/>
+          </w:tcPr>
+          <w:p>
+            <w:r>
+              <w:rPr>
+                <w:b/>
+                <w:sz w:val="18"/>
+              </w:rPr>
+            </w:r>
+            <w:r>
+              <w:rPr>
+                <w:b/>
+                <w:sz w:val="18"/>
+              </w:rPr>
+              <w:t>True state ↓ / Action →</w:t>
+            </w:r>
+          </w:p>
+        </w:tc>
+        <w:tc>
+          <w:tcPr>
+            <w:tcW w:type="dxa" w:w="2160"/>
+          </w:tcPr>
+          <w:p>
+            <w:r>
+              <w:rPr>
+                <w:b/>
+                <w:sz w:val="18"/>
+              </w:rPr>
+            </w:r>
+            <w:r>
+              <w:rPr>
+                <w:b/>
+                <w:sz w:val="18"/>
+              </w:rPr>
+              <w:t>do not run</w:t>
+            </w:r>
+          </w:p>
+        </w:tc>
+        <w:tc>
+          <w:tcPr>
+            <w:tcW w:type="dxa" w:w="2160"/>
+          </w:tcPr>
+          <w:p>
+            <w:r>
+              <w:rPr>
+                <w:b/>
+                <w:sz w:val="18"/>
+              </w:rPr>
+            </w:r>
+            <w:r>
+              <w:rPr>
+                <w:b/>
+                <w:sz w:val="18"/>
+              </w:rPr>
+              <w:t>target group 1</w:t>
+            </w:r>
+          </w:p>
+        </w:tc>
+        <w:tc>
+          <w:tcPr>
+            <w:tcW w:type="dxa" w:w="2160"/>
+          </w:tcPr>
+          <w:p>
+            <w:r>
+              <w:rPr>
+                <w:b/>
+                <w:sz w:val="18"/>
+              </w:rPr>
+            </w:r>
+            <w:r>
+              <w:rPr>
+                <w:b/>
+                <w:sz w:val="18"/>
+              </w:rPr>
+              <w:t>target group 2</w:t>
+            </w:r>
+          </w:p>
+        </w:tc>
+      </w:tr>
+      <w:tr>
+        <w:tc>
+          <w:tcPr>
+            <w:tcW w:type="dxa" w:w="2160"/>
+          </w:tcPr>
+          <w:p>
+            <w:r>
+              <w:rPr>
+                <w:sz w:val="18"/>
+              </w:rPr>
+            </w:r>
+            <w:r>
+              <w:rPr>
+                <w:sz w:val="18"/>
+              </w:rPr>
+              <w:t>neither profitable</w:t>
+            </w:r>
+          </w:p>
+        </w:tc>
+        <w:tc>
+          <w:tcPr>
+            <w:tcW w:type="dxa" w:w="2160"/>
+          </w:tcPr>
+          <w:p>
+            <w:r>
+              <w:rPr>
+                <w:sz w:val="18"/>
+              </w:rPr>
+            </w:r>
+            <w:r>
+              <w:rPr>
+                <w:sz w:val="18"/>
+              </w:rPr>
+              <w:t>saved spend</w:t>
+            </w:r>
+          </w:p>
+        </w:tc>
+        <w:tc>
+          <w:tcPr>
+            <w:tcW w:type="dxa" w:w="2160"/>
+          </w:tcPr>
+          <w:p>
+            <w:r>
+              <w:rPr>
+                <w:sz w:val="18"/>
+              </w:rPr>
+            </w:r>
+            <w:r>
+              <w:rPr>
+                <w:sz w:val="18"/>
+              </w:rPr>
+              <w:t>−spend</w:t>
+            </w:r>
+          </w:p>
+        </w:tc>
+        <w:tc>
+          <w:tcPr>
+            <w:tcW w:type="dxa" w:w="2160"/>
+          </w:tcPr>
+          <w:p>
+            <w:r>
+              <w:rPr>
+                <w:sz w:val="18"/>
+              </w:rPr>
+            </w:r>
+            <w:r>
+              <w:rPr>
+                <w:sz w:val="18"/>
+              </w:rPr>
+              <w:t>−spend</w:t>
+            </w:r>
+          </w:p>
+        </w:tc>
+      </w:tr>
+      <w:tr>
+        <w:tc>
+          <w:tcPr>
+            <w:tcW w:type="dxa" w:w="2160"/>
+          </w:tcPr>
+          <w:p>
+            <w:r>
+              <w:rPr>
+                <w:sz w:val="18"/>
+              </w:rPr>
+            </w:r>
+            <w:r>
+              <w:rPr>
+                <w:sz w:val="18"/>
+              </w:rPr>
+              <w:t>group 1 profitable</w:t>
+            </w:r>
+          </w:p>
+        </w:tc>
+        <w:tc>
+          <w:tcPr>
+            <w:tcW w:type="dxa" w:w="2160"/>
+          </w:tcPr>
+          <w:p>
+            <w:r>
+              <w:rPr>
+                <w:sz w:val="18"/>
+              </w:rPr>
+            </w:r>
+            <w:r>
+              <w:rPr>
+                <w:sz w:val="18"/>
+              </w:rPr>
+              <w:t>−foregone margin</w:t>
+            </w:r>
+          </w:p>
+        </w:tc>
+        <w:tc>
+          <w:tcPr>
+            <w:tcW w:type="dxa" w:w="2160"/>
+          </w:tcPr>
+          <w:p>
+            <w:r>
+              <w:rPr>
+                <w:sz w:val="18"/>
+              </w:rPr>
+            </w:r>
+            <w:r>
+              <w:rPr>
+                <w:sz w:val="18"/>
+              </w:rPr>
+              <w:t>+margin₁</w:t>
+            </w:r>
+          </w:p>
+        </w:tc>
+        <w:tc>
+          <w:tcPr>
+            <w:tcW w:type="dxa" w:w="2160"/>
+          </w:tcPr>
+          <w:p>
+            <w:r>
+              <w:rPr>
+                <w:sz w:val="18"/>
+              </w:rPr>
+            </w:r>
+            <w:r>
+              <w:rPr>
+                <w:sz w:val="18"/>
+              </w:rPr>
+              <w:t>−spend</w:t>
+            </w:r>
+          </w:p>
+        </w:tc>
+      </w:tr>
+      <w:tr>
+        <w:tc>
+          <w:tcPr>
+            <w:tcW w:type="dxa" w:w="2160"/>
+          </w:tcPr>
+          <w:p>
+            <w:r>
+              <w:rPr>
+                <w:sz w:val="18"/>
+              </w:rPr>
+            </w:r>
+            <w:r>
+              <w:rPr>
+                <w:sz w:val="18"/>
+              </w:rPr>
+              <w:t>group 2 profitable</w:t>
+            </w:r>
+          </w:p>
+        </w:tc>
+        <w:tc>
+          <w:tcPr>
+            <w:tcW w:type="dxa" w:w="2160"/>
+          </w:tcPr>
+          <w:p>
+            <w:r>
+              <w:rPr>
+                <w:sz w:val="18"/>
+              </w:rPr>
+            </w:r>
+            <w:r>
+              <w:rPr>
+                <w:sz w:val="18"/>
+              </w:rPr>
+              <w:t>−foregone margin</w:t>
+            </w:r>
+          </w:p>
+        </w:tc>
+        <w:tc>
+          <w:tcPr>
+            <w:tcW w:type="dxa" w:w="2160"/>
+          </w:tcPr>
+          <w:p>
+            <w:r>
+              <w:rPr>
+                <w:sz w:val="18"/>
+              </w:rPr>
+            </w:r>
+            <w:r>
+              <w:rPr>
+                <w:sz w:val="18"/>
+              </w:rPr>
+              <w:t>−spend</w:t>
+            </w:r>
+          </w:p>
+        </w:tc>
+        <w:tc>
+          <w:tcPr>
+            <w:tcW w:type="dxa" w:w="2160"/>
+          </w:tcPr>
+          <w:p>
+            <w:r>
+              <w:rPr>
+                <w:sz w:val="18"/>
+              </w:rPr>
+            </w:r>
+            <w:r>
+              <w:rPr>
+                <w:sz w:val="18"/>
+              </w:rPr>
+              <w:t>+margin₂</w:t>
+            </w:r>
+          </w:p>
+        </w:tc>
+      </w:tr>
+    </w:tbl>
+    <w:p/>
+    <w:p>
+      <w:r>
+        <w:t xml:space="preserve">Each cell has its own euro consequence, and the total is the sum over the confusion matrix weighted by those nine values. The decision layer already uses exactly this structure — it is the cost matrix in §5 of the model card — so the machinery exists. </w:t>
+      </w:r>
+      <w:r>
+        <w:rPr>
+          <w:b/>
+        </w:rPr>
+        <w:t>What is missing is the three business numbers</w:t>
+      </w:r>
+      <w:r>
+        <w:t>, and until the marketing team supplies them, filling them in produces a figure with the precision of a measurement and the content of a guess.</w:t>
+      </w:r>
+    </w:p>
+    <w:p>
+      <w:r>
+        <w:t xml:space="preserve">That is why the decision layer ships </w:t>
+      </w:r>
+      <w:r>
+        <w:rPr>
+          <w:b/>
+        </w:rPr>
+        <w:t>disabled by default</w:t>
+      </w:r>
+      <w:r>
+        <w:t>, and why results are reported as a sensitivity analysis across three plausible cost ratios rather than as one euro total.</w:t>
       </w:r>
     </w:p>
     <w:p>
@@ -18437,7 +19797,20 @@
               <w:rPr>
                 <w:sz w:val="18"/>
               </w:rPr>
-              <w:t xml:space="preserve"> 53.8% of predictions flip under a group swap, so a change in how upstream assigns "group 1" degrades the model sharply and silently</w:t>
+              <w:t xml:space="preserve"> 53.8% of predictions </w:t>
+            </w:r>
+            <w:r>
+              <w:rPr>
+                <w:i/>
+                <w:sz w:val="18"/>
+              </w:rPr>
+              <w:t>fail to transform correctly</w:t>
+            </w:r>
+            <w:r>
+              <w:rPr>
+                <w:sz w:val="18"/>
+              </w:rPr>
+              <w:t xml:space="preserve"> under a group swap (the symmetry requires 0→0, 1→2, 2→1), so the model relies heavily on which slot a group occupies and a change in the upstream convention degrades it sharply and silently</w:t>
             </w:r>
           </w:p>
         </w:tc>
@@ -22014,21 +23387,16 @@
         <w:t>The cold start is the finding.</w:t>
       </w:r>
       <w:r>
-        <w:t xml:space="preserve"> Steady-state performance is comfortable — p95 under 100 ms end-to-end, and the model is loaded once at container startup rather than per request. But a scale-to-zero service pays container start, image pull and model deserialisation on the first request after an idle period, and here that is </w:t>
+        <w:t xml:space="preserve"> Steady-state performance is comfortable — </w:t>
       </w:r>
       <w:r>
         <w:rPr>
           <w:b/>
         </w:rPr>
-        <w:t>15.5 seconds</w:t>
-      </w:r>
-      <w:r>
-        <w:t>.</w:t>
-      </w:r>
-    </w:p>
-    <w:p>
-      <w:r>
-        <w:t xml:space="preserve">For campaign planning that is defensible: sessions are bursty, one person absorbs a 15-second wait once per session, and the alternative is paying for an always-warm instance between campaigns. But it is a real trade-off with a name, not an oversight, and it should be revisited if either of two things becomes true — the API acquires a machine consumer that retries on timeout, or the frontend's first-load experience is judged unacceptable. The lever is </w:t>
+        <w:t>median 129 ms, p95 178 ms</w:t>
+      </w:r>
+      <w:r>
+        <w:t xml:space="preserve"> end-to-end (</w:t>
       </w:r>
       <w:r>
         <w:rPr>
@@ -22036,10 +23404,30 @@
           <w:color w:val="B03060"/>
           <w:sz w:val="19"/>
         </w:rPr>
-        <w:t>api_min_instances</w:t>
-      </w:r>
-      <w:r>
-        <w:t xml:space="preserve"> in </w:t>
+        <w:t>reports/latency.json</w:t>
+      </w:r>
+      <w:r>
+        <w:t>), with the model loaded once at container startup rather than per request. But a scale-to-zero service pays container start, image pull and deserialisation of a 47 MB artifact on the first request after an idle period.</w:t>
+      </w:r>
+    </w:p>
+    <w:p>
+      <w:r>
+        <w:rPr>
+          <w:b/>
+        </w:rPr>
+        <w:t>How long that takes is *not* something this project has measured repeatably</w:t>
+      </w:r>
+      <w:r>
+        <w:t xml:space="preserve">, and the distinction matters. A single observation against a genuinely cold container recorded roughly 15 seconds; a later run against a service Cloud Run had kept warm recorded 1.2 seconds for its first request. Both are in the same file at different times, which is why the honest statement is </w:t>
+      </w:r>
+      <w:r>
+        <w:rPr>
+          <w:i/>
+        </w:rPr>
+        <w:t>"of the order of seconds, observed once at ~15 s"</w:t>
+      </w:r>
+      <w:r>
+        <w:t xml:space="preserve"> rather than a figure quoted as though established. An earlier version of this document quoted 15.5 s and sub-100 ms p95 while </w:t>
       </w:r>
       <w:r>
         <w:rPr>
@@ -22047,24 +23435,15 @@
           <w:color w:val="B03060"/>
           <w:sz w:val="19"/>
         </w:rPr>
-        <w:t>terraform/variables.tf</w:t>
-      </w:r>
-      <w:r>
-        <w:t>, currently 0.</w:t>
-      </w:r>
-    </w:p>
-    <w:p>
-      <w:r>
-        <w:t xml:space="preserve">One caveat on this measurement: it was taken against an image built </w:t>
-      </w:r>
-      <w:r>
-        <w:rPr>
-          <w:b/>
-        </w:rPr>
-        <w:t>before</w:t>
-      </w:r>
-      <w:r>
-        <w:t xml:space="preserve"> the serving container was slimmed to </w:t>
+        <w:t>latency.json</w:t>
+      </w:r>
+      <w:r>
+        <w:t xml:space="preserve"> held different values — a contradiction found in review, not by me.</w:t>
+      </w:r>
+    </w:p>
+    <w:p>
+      <w:r>
+        <w:t xml:space="preserve">For campaign planning a slow first request is defensible: sessions are bursty, one person absorbs the wait once per session, and the alternative is paying for an always-warm instance between campaigns. But it is a real trade-off with a name, not an oversight, and it should be revisited if either of two things becomes true — the API acquires a machine consumer that retries on timeout, or the frontend's first-load experience is judged unacceptable. The lever is </w:t>
       </w:r>
       <w:r>
         <w:rPr>
@@ -22072,21 +23451,10 @@
           <w:color w:val="B03060"/>
           <w:sz w:val="19"/>
         </w:rPr>
-        <w:t>requirements-serve.txt</w:t>
-      </w:r>
-      <w:r>
-        <w:t>. Image pull is a large share of cold start, so the current figure should fall materially after the next deploy — worth re-measuring rather than assuming.</w:t>
-      </w:r>
-    </w:p>
-    <w:p>
-      <w:r>
-        <w:rPr>
-          <w:b/>
-        </w:rPr>
-        <w:t>Reliability</w:t>
-      </w:r>
-      <w:r>
-        <w:t xml:space="preserve"> — </w:t>
+        <w:t>api_min_instances</w:t>
+      </w:r>
+      <w:r>
+        <w:t xml:space="preserve"> in </w:t>
       </w:r>
       <w:r>
         <w:rPr>
@@ -22094,10 +23462,24 @@
           <w:color w:val="B03060"/>
           <w:sz w:val="19"/>
         </w:rPr>
-        <w:t>/health</w:t>
-      </w:r>
-      <w:r>
-        <w:t xml:space="preserve"> drives readiness probes. </w:t>
+        <w:t>terraform/variables.tf</w:t>
+      </w:r>
+      <w:r>
+        <w:t>, currently 0.</w:t>
+      </w:r>
+    </w:p>
+    <w:p>
+      <w:r>
+        <w:t xml:space="preserve">One caveat on this measurement: it was taken against an image built </w:t>
+      </w:r>
+      <w:r>
+        <w:rPr>
+          <w:b/>
+        </w:rPr>
+        <w:t>before</w:t>
+      </w:r>
+      <w:r>
+        <w:t xml:space="preserve"> the serving container was slimmed to </w:t>
       </w:r>
       <w:r>
         <w:rPr>
@@ -22105,6 +23487,39 @@
           <w:color w:val="B03060"/>
           <w:sz w:val="19"/>
         </w:rPr>
+        <w:t>requirements-serve.txt</w:t>
+      </w:r>
+      <w:r>
+        <w:t>. Image pull is a large share of cold start, so the current figure should fall materially after the next deploy — worth re-measuring rather than assuming.</w:t>
+      </w:r>
+    </w:p>
+    <w:p>
+      <w:r>
+        <w:rPr>
+          <w:b/>
+        </w:rPr>
+        <w:t>Reliability</w:t>
+      </w:r>
+      <w:r>
+        <w:t xml:space="preserve"> — </w:t>
+      </w:r>
+      <w:r>
+        <w:rPr>
+          <w:rFonts w:ascii="Consolas" w:hAnsi="Consolas"/>
+          <w:color w:val="B03060"/>
+          <w:sz w:val="19"/>
+        </w:rPr>
+        <w:t>/health</w:t>
+      </w:r>
+      <w:r>
+        <w:t xml:space="preserve"> drives readiness probes. </w:t>
+      </w:r>
+      <w:r>
+        <w:rPr>
+          <w:rFonts w:ascii="Consolas" w:hAnsi="Consolas"/>
+          <w:color w:val="B03060"/>
+          <w:sz w:val="19"/>
+        </w:rPr>
         <w:t>ALLOW_BASELINE_FALLBACK=false</w:t>
       </w:r>
       <w:r>
@@ -22119,7 +23534,339 @@
         <w:t>Security</w:t>
       </w:r>
       <w:r>
-        <w:t xml:space="preserve"> — no PII in the payload (aggregate group statistics only); non-root container user; CORS restricted to the frontend origin in production; API Gateway or IAM in front for authentication.</w:t>
+        <w:t xml:space="preserve"> — no PII in the payload (aggregate group statistics only); non-root container user; CORS restricted to the frontend origin in production.</w:t>
+      </w:r>
+    </w:p>
+    <w:p>
+      <w:pPr>
+        <w:pStyle w:val="Heading4"/>
+      </w:pPr>
+      <w:r>
+        <w:t>Authentication and rate limiting — stated, not implemented</w:t>
+      </w:r>
+    </w:p>
+    <w:p>
+      <w:r>
+        <w:rPr>
+          <w:b/>
+        </w:rPr>
+        <w:t>The deployed service is intentionally unauthenticated, and this is a submission decision rather than an oversight.</w:t>
+      </w:r>
+      <w:r>
+        <w:t xml:space="preserve"> It exists so the API can be evaluated by opening a URL. Handing a credential to three reviewers by email would be worse practice than the exposure it prevents, and the endpoint carries no personal data — the payload is 67 aggregate group statistics and the response is a targeting recommendation.</w:t>
+      </w:r>
+    </w:p>
+    <w:p>
+      <w:r>
+        <w:rPr>
+          <w:b/>
+        </w:rPr>
+        <w:t>What production requires instead, and why each choice sits where it does:</w:t>
+      </w:r>
+    </w:p>
+    <w:tbl>
+      <w:tblPr>
+        <w:tblStyle w:val="LightGrid-Accent1"/>
+        <w:tblW w:type="auto" w:w="0"/>
+        <w:tblLook w:firstColumn="1" w:firstRow="1" w:lastColumn="0" w:lastRow="0" w:noHBand="0" w:noVBand="1" w:val="04A0"/>
+      </w:tblPr>
+      <w:tblGrid>
+        <w:gridCol w:w="2880"/>
+        <w:gridCol w:w="2880"/>
+        <w:gridCol w:w="2880"/>
+      </w:tblGrid>
+      <w:tr>
+        <w:tc>
+          <w:tcPr>
+            <w:tcW w:type="dxa" w:w="2880"/>
+          </w:tcPr>
+          <w:p>
+            <w:r>
+              <w:rPr>
+                <w:b/>
+                <w:sz w:val="18"/>
+              </w:rPr>
+            </w:r>
+            <w:r>
+              <w:rPr>
+                <w:b/>
+                <w:sz w:val="18"/>
+              </w:rPr>
+              <w:t>Control</w:t>
+            </w:r>
+          </w:p>
+        </w:tc>
+        <w:tc>
+          <w:tcPr>
+            <w:tcW w:type="dxa" w:w="2880"/>
+          </w:tcPr>
+          <w:p>
+            <w:r>
+              <w:rPr>
+                <w:b/>
+                <w:sz w:val="18"/>
+              </w:rPr>
+            </w:r>
+            <w:r>
+              <w:rPr>
+                <w:b/>
+                <w:sz w:val="18"/>
+              </w:rPr>
+              <w:t>Where</w:t>
+            </w:r>
+          </w:p>
+        </w:tc>
+        <w:tc>
+          <w:tcPr>
+            <w:tcW w:type="dxa" w:w="2880"/>
+          </w:tcPr>
+          <w:p>
+            <w:r>
+              <w:rPr>
+                <w:b/>
+                <w:sz w:val="18"/>
+              </w:rPr>
+            </w:r>
+            <w:r>
+              <w:rPr>
+                <w:b/>
+                <w:sz w:val="18"/>
+              </w:rPr>
+              <w:t>Why not in the application</w:t>
+            </w:r>
+          </w:p>
+        </w:tc>
+      </w:tr>
+      <w:tr>
+        <w:tc>
+          <w:tcPr>
+            <w:tcW w:type="dxa" w:w="2880"/>
+          </w:tcPr>
+          <w:p>
+            <w:r>
+              <w:rPr>
+                <w:sz w:val="18"/>
+              </w:rPr>
+            </w:r>
+            <w:r>
+              <w:rPr>
+                <w:sz w:val="18"/>
+              </w:rPr>
+              <w:t>Authentication</w:t>
+            </w:r>
+          </w:p>
+        </w:tc>
+        <w:tc>
+          <w:tcPr>
+            <w:tcW w:type="dxa" w:w="2880"/>
+          </w:tcPr>
+          <w:p>
+            <w:r>
+              <w:rPr>
+                <w:sz w:val="18"/>
+              </w:rPr>
+            </w:r>
+            <w:r>
+              <w:rPr>
+                <w:sz w:val="18"/>
+              </w:rPr>
+              <w:t xml:space="preserve">Remove </w:t>
+            </w:r>
+            <w:r>
+              <w:rPr>
+                <w:rFonts w:ascii="Consolas" w:hAnsi="Consolas"/>
+                <w:color w:val="B03060"/>
+                <w:sz w:val="18"/>
+              </w:rPr>
+              <w:t>--allow-unauthenticated</w:t>
+            </w:r>
+            <w:r>
+              <w:rPr>
+                <w:sz w:val="18"/>
+              </w:rPr>
+              <w:t xml:space="preserve">; caller holds </w:t>
+            </w:r>
+            <w:r>
+              <w:rPr>
+                <w:rFonts w:ascii="Consolas" w:hAnsi="Consolas"/>
+                <w:color w:val="B03060"/>
+                <w:sz w:val="18"/>
+              </w:rPr>
+              <w:t>roles/run.invoker</w:t>
+            </w:r>
+          </w:p>
+        </w:tc>
+        <w:tc>
+          <w:tcPr>
+            <w:tcW w:type="dxa" w:w="2880"/>
+          </w:tcPr>
+          <w:p>
+            <w:r>
+              <w:rPr>
+                <w:sz w:val="18"/>
+              </w:rPr>
+            </w:r>
+            <w:r>
+              <w:rPr>
+                <w:sz w:val="18"/>
+              </w:rPr>
+              <w:t>Cloud Run checks the IAM token before the container is reached. An in-app API key would still require the request to be admitted, scheduled and parsed first</w:t>
+            </w:r>
+          </w:p>
+        </w:tc>
+      </w:tr>
+      <w:tr>
+        <w:tc>
+          <w:tcPr>
+            <w:tcW w:type="dxa" w:w="2880"/>
+          </w:tcPr>
+          <w:p>
+            <w:r>
+              <w:rPr>
+                <w:sz w:val="18"/>
+              </w:rPr>
+            </w:r>
+            <w:r>
+              <w:rPr>
+                <w:sz w:val="18"/>
+              </w:rPr>
+              <w:t>Rate limiting</w:t>
+            </w:r>
+          </w:p>
+        </w:tc>
+        <w:tc>
+          <w:tcPr>
+            <w:tcW w:type="dxa" w:w="2880"/>
+          </w:tcPr>
+          <w:p>
+            <w:r>
+              <w:rPr>
+                <w:sz w:val="18"/>
+              </w:rPr>
+            </w:r>
+            <w:r>
+              <w:rPr>
+                <w:sz w:val="18"/>
+              </w:rPr>
+              <w:t>Cloud Armor at the load balancer</w:t>
+            </w:r>
+          </w:p>
+        </w:tc>
+        <w:tc>
+          <w:tcPr>
+            <w:tcW w:type="dxa" w:w="2880"/>
+          </w:tcPr>
+          <w:p>
+            <w:r>
+              <w:rPr>
+                <w:sz w:val="18"/>
+              </w:rPr>
+            </w:r>
+            <w:r>
+              <w:rPr>
+                <w:sz w:val="18"/>
+              </w:rPr>
+              <w:t xml:space="preserve">An in-process limiter on a scale-to-zero service limits </w:t>
+            </w:r>
+            <w:r>
+              <w:rPr>
+                <w:i/>
+                <w:sz w:val="18"/>
+              </w:rPr>
+              <w:t>per instance</w:t>
+            </w:r>
+            <w:r>
+              <w:rPr>
+                <w:sz w:val="18"/>
+              </w:rPr>
+              <w:t>. Cloud Run adds instances under load, so the effective global limit rises exactly when a limit is needed. The constraint belongs to the edge</w:t>
+            </w:r>
+          </w:p>
+        </w:tc>
+      </w:tr>
+      <w:tr>
+        <w:tc>
+          <w:tcPr>
+            <w:tcW w:type="dxa" w:w="2880"/>
+          </w:tcPr>
+          <w:p>
+            <w:r>
+              <w:rPr>
+                <w:sz w:val="18"/>
+              </w:rPr>
+            </w:r>
+            <w:r>
+              <w:rPr>
+                <w:sz w:val="18"/>
+              </w:rPr>
+              <w:t>Quota per caller</w:t>
+            </w:r>
+          </w:p>
+        </w:tc>
+        <w:tc>
+          <w:tcPr>
+            <w:tcW w:type="dxa" w:w="2880"/>
+          </w:tcPr>
+          <w:p>
+            <w:r>
+              <w:rPr>
+                <w:sz w:val="18"/>
+              </w:rPr>
+            </w:r>
+            <w:r>
+              <w:rPr>
+                <w:sz w:val="18"/>
+              </w:rPr>
+              <w:t>API Gateway or Apigee</w:t>
+            </w:r>
+          </w:p>
+        </w:tc>
+        <w:tc>
+          <w:tcPr>
+            <w:tcW w:type="dxa" w:w="2880"/>
+          </w:tcPr>
+          <w:p>
+            <w:r>
+              <w:rPr>
+                <w:sz w:val="18"/>
+              </w:rPr>
+            </w:r>
+            <w:r>
+              <w:rPr>
+                <w:sz w:val="18"/>
+              </w:rPr>
+              <w:t>Per-consumer quotas need an identity the service does not have</w:t>
+            </w:r>
+          </w:p>
+        </w:tc>
+      </w:tr>
+    </w:tbl>
+    <w:p/>
+    <w:p>
+      <w:r>
+        <w:t xml:space="preserve">The Terraform change is two lines. The reason it is not applied is that a reviewer clicking a link and receiving </w:t>
+      </w:r>
+      <w:r>
+        <w:rPr>
+          <w:rFonts w:ascii="Consolas" w:hAnsi="Consolas"/>
+          <w:color w:val="B03060"/>
+          <w:sz w:val="19"/>
+        </w:rPr>
+        <w:t>401</w:t>
+      </w:r>
+      <w:r>
+        <w:t xml:space="preserve"> learns less about this system than a reviewer receiving a prediction.</w:t>
+      </w:r>
+    </w:p>
+    <w:p>
+      <w:r>
+        <w:rPr>
+          <w:b/>
+        </w:rPr>
+        <w:t>One control that is *not* deferred:</w:t>
+      </w:r>
+      <w:r>
+        <w:t xml:space="preserve"> input validation. Rejecting non-finite values, implausible magnitudes and mostly-null payloads is enforced in the Pydantic schema, because that is a correctness property rather than a perimeter one. A campaign must never be approved from an empty request, and no amount of authentication would have prevented that.</w:t>
       </w:r>
     </w:p>
     <w:p>
@@ -24826,7 +26573,7 @@
                 <w:color w:val="B03060"/>
                 <w:sz w:val="18"/>
               </w:rPr>
-              <w:t>notebooks/01_eda.ipynb</w:t>
+              <w:t>notebooks/01_analysis.ipynb</w:t>
             </w:r>
             <w:r>
               <w:rPr>
@@ -25823,6 +27570,120 @@
       </w:r>
     </w:p>
     <w:p>
+      <w:r>
+        <w:rPr>
+          <w:b/>
+        </w:rPr>
+        <w:t>What this check does not do, stated precisely.</w:t>
+      </w:r>
+      <w:r>
+        <w:t xml:space="preserve"> It inspects </w:t>
+      </w:r>
+      <w:r>
+        <w:rPr>
+          <w:rFonts w:ascii="Consolas" w:hAnsi="Consolas"/>
+          <w:color w:val="B03060"/>
+          <w:sz w:val="19"/>
+        </w:rPr>
+        <w:t>git diff --cached</w:t>
+      </w:r>
+      <w:r>
+        <w:t xml:space="preserve"> — the </w:t>
+      </w:r>
+      <w:r>
+        <w:rPr>
+          <w:b/>
+        </w:rPr>
+        <w:t>staged</w:t>
+      </w:r>
+      <w:r>
+        <w:t xml:space="preserve"> changes of the commit being made. It therefore does </w:t>
+      </w:r>
+      <w:r>
+        <w:rPr>
+          <w:i/>
+        </w:rPr>
+        <w:t>not</w:t>
+      </w:r>
+      <w:r>
+        <w:t xml:space="preserve"> scan the working tree, does </w:t>
+      </w:r>
+      <w:r>
+        <w:rPr>
+          <w:i/>
+        </w:rPr>
+        <w:t>not</w:t>
+      </w:r>
+      <w:r>
+        <w:t xml:space="preserve"> audit existing history, and does </w:t>
+      </w:r>
+      <w:r>
+        <w:rPr>
+          <w:i/>
+        </w:rPr>
+        <w:t>not</w:t>
+      </w:r>
+      <w:r>
+        <w:t xml:space="preserve"> inspect a release archive. Running it in a repository where </w:t>
+      </w:r>
+      <w:r>
+        <w:rPr>
+          <w:rFonts w:ascii="Consolas" w:hAnsi="Consolas"/>
+          <w:color w:val="B03060"/>
+          <w:sz w:val="19"/>
+        </w:rPr>
+        <w:t>data/customerGroups.csv</w:t>
+      </w:r>
+      <w:r>
+        <w:t xml:space="preserve"> merely </w:t>
+      </w:r>
+      <w:r>
+        <w:rPr>
+          <w:i/>
+        </w:rPr>
+        <w:t>exists</w:t>
+      </w:r>
+      <w:r>
+        <w:t xml:space="preserve"> will pass, correctly, because nothing is staged.</w:t>
+      </w:r>
+    </w:p>
+    <w:p>
+      <w:r>
+        <w:t xml:space="preserve">That distinction matters because relying on it for more than it does is exactly how the dataset reached a submission archive: the commit guard held, and the packaging step had no guard at all. Archive safety is a separate mechanism — </w:t>
+      </w:r>
+      <w:r>
+        <w:rPr>
+          <w:rFonts w:ascii="Consolas" w:hAnsi="Consolas"/>
+          <w:color w:val="B03060"/>
+          <w:sz w:val="19"/>
+        </w:rPr>
+        <w:t>scripts/build_release.py</w:t>
+      </w:r>
+      <w:r>
+        <w:t xml:space="preserve"> builds from an </w:t>
+      </w:r>
+      <w:r>
+        <w:rPr>
+          <w:b/>
+        </w:rPr>
+        <w:t>allowlist</w:t>
+      </w:r>
+      <w:r>
+        <w:t xml:space="preserve"> and refuses to write if any </w:t>
+      </w:r>
+      <w:r>
+        <w:rPr>
+          <w:rFonts w:ascii="Consolas" w:hAnsi="Consolas"/>
+          <w:color w:val="B03060"/>
+          <w:sz w:val="19"/>
+        </w:rPr>
+        <w:t>.csv</w:t>
+      </w:r>
+      <w:r>
+        <w:t xml:space="preserve"> outside three named derived tables appears in the manifest.</w:t>
+      </w:r>
+    </w:p>
+    <w:p>
       <w:pPr>
         <w:pStyle w:val="Heading4"/>
       </w:pPr>
@@ -25867,7 +27728,89 @@
           <w:rFonts w:ascii="Consolas" w:hAnsi="Consolas"/>
           <w:sz w:val="18"/>
         </w:rPr>
-        <w:t>campaign-train --data data/customerGroups.csv --out artifacts</w:t>
+        <w:t>campaign-train --data data/customerGroups.csv --out artifacts \</w:t>
+        <w:br/>
+        <w:t xml:space="preserve">    --calibrate --holdout-seed 20260819</w:t>
+      </w:r>
+    </w:p>
+    <w:p>
+      <w:r>
+        <w:rPr>
+          <w:b/>
+        </w:rPr>
+        <w:t>The two flags are not optional.</w:t>
+      </w:r>
+      <w:r>
+        <w:t xml:space="preserve"> </w:t>
+      </w:r>
+      <w:r>
+        <w:rPr>
+          <w:rFonts w:ascii="Consolas" w:hAnsi="Consolas"/>
+          <w:color w:val="B03060"/>
+          <w:sz w:val="19"/>
+        </w:rPr>
+        <w:t>--holdout-seed</w:t>
+      </w:r>
+      <w:r>
+        <w:t xml:space="preserve"> fixes </w:t>
+      </w:r>
+      <w:r>
+        <w:rPr>
+          <w:i/>
+        </w:rPr>
+        <w:t>which</w:t>
+      </w:r>
+      <w:r>
+        <w:t xml:space="preserve"> campaigns are held out — omitting it falls back to 42 and produces a different test set, and therefore different accuracy, lift, class-0 recall and symmetry figures. </w:t>
+      </w:r>
+      <w:r>
+        <w:rPr>
+          <w:rFonts w:ascii="Consolas" w:hAnsi="Consolas"/>
+          <w:color w:val="B03060"/>
+          <w:sz w:val="19"/>
+        </w:rPr>
+        <w:t>--calibrate</w:t>
+      </w:r>
+      <w:r>
+        <w:t xml:space="preserve"> reserves the 1,060-row calibration split that makes thresholds and the calibrator selectable without touching test; without it the split is 5,296 / – / 1,324 and every reported number shifts.</w:t>
+      </w:r>
+    </w:p>
+    <w:p>
+      <w:r>
+        <w:t xml:space="preserve">This is written out because a bare </w:t>
+      </w:r>
+      <w:r>
+        <w:rPr>
+          <w:rFonts w:ascii="Consolas" w:hAnsi="Consolas"/>
+          <w:color w:val="B03060"/>
+          <w:sz w:val="19"/>
+        </w:rPr>
+        <w:t>--data ... --out artifacts</w:t>
+      </w:r>
+      <w:r>
+        <w:t xml:space="preserve"> once overwrote the canonical artifact with a differently-split experiment, and the deployed service then served a model whose accuracy matched no document describing it. </w:t>
+      </w:r>
+      <w:r>
+        <w:rPr>
+          <w:rFonts w:ascii="Consolas" w:hAnsi="Consolas"/>
+          <w:color w:val="B03060"/>
+          <w:sz w:val="19"/>
+        </w:rPr>
+        <w:t>make train</w:t>
+      </w:r>
+      <w:r>
+        <w:t xml:space="preserve"> carries the flags; verify with </w:t>
+      </w:r>
+      <w:r>
+        <w:rPr>
+          <w:rFonts w:ascii="Consolas" w:hAnsi="Consolas"/>
+          <w:color w:val="B03060"/>
+          <w:sz w:val="19"/>
+        </w:rPr>
+        <w:t>make verify-artifact</w:t>
+      </w:r>
+      <w:r>
+        <w:t>, which asserts the artifact on disk is the documented run and exits non-zero otherwise.</w:t>
       </w:r>
     </w:p>
     <w:p>
@@ -26188,7 +28131,7 @@
               <w:rPr>
                 <w:sz w:val="18"/>
               </w:rPr>
-              <w:t>Full model zoo</w:t>
+              <w:t>Full model zoo + tracking</w:t>
             </w:r>
           </w:p>
         </w:tc>
@@ -26206,7 +28149,7 @@
               <w:rPr>
                 <w:sz w:val="18"/>
               </w:rPr>
-              <w:t>CatBoost, LightGBM, XGBoost, SHAP — all guarded imports</w:t>
+              <w:t>CatBoost, LightGBM, XGBoost, SHAP, MLflow — all guarded imports</w:t>
             </w:r>
           </w:p>
         </w:tc>
@@ -26236,6 +28179,438 @@
       </w:r>
       <w:r>
         <w:t>. JupyterLab, Streamlit, matplotlib and pytest have no role in answering a prediction, and shipping them costs image size, Cloud Run cold-start latency and CVE surface for code the process never loads.</w:t>
+      </w:r>
+    </w:p>
+    <w:p>
+      <w:r>
+        <w:rPr>
+          <w:b/>
+        </w:rPr>
+        <w:t>Pinning is selective, not uniform.</w:t>
+      </w:r>
+      <w:r>
+        <w:t xml:space="preserve"> The question worth asking of each dependency is </w:t>
+      </w:r>
+      <w:r>
+        <w:rPr>
+          <w:i/>
+        </w:rPr>
+        <w:t>what must this be identical to?</w:t>
+      </w:r>
+      <w:r>
+        <w:t xml:space="preserve"> — and only the four that deserialise the pickle have to be identical to anything:</w:t>
+      </w:r>
+    </w:p>
+    <w:tbl>
+      <w:tblPr>
+        <w:tblStyle w:val="LightGrid-Accent1"/>
+        <w:tblW w:type="auto" w:w="0"/>
+        <w:tblLook w:firstColumn="1" w:firstRow="1" w:lastColumn="0" w:lastRow="0" w:noHBand="0" w:noVBand="1" w:val="04A0"/>
+      </w:tblPr>
+      <w:tblGrid>
+        <w:gridCol w:w="2880"/>
+        <w:gridCol w:w="2880"/>
+        <w:gridCol w:w="2880"/>
+      </w:tblGrid>
+      <w:tr>
+        <w:tc>
+          <w:tcPr>
+            <w:tcW w:type="dxa" w:w="2880"/>
+          </w:tcPr>
+          <w:p>
+            <w:r>
+              <w:rPr>
+                <w:b/>
+                <w:sz w:val="18"/>
+              </w:rPr>
+            </w:r>
+            <w:r>
+              <w:rPr>
+                <w:b/>
+                <w:sz w:val="18"/>
+              </w:rPr>
+              <w:t>Packages</w:t>
+            </w:r>
+          </w:p>
+        </w:tc>
+        <w:tc>
+          <w:tcPr>
+            <w:tcW w:type="dxa" w:w="2880"/>
+          </w:tcPr>
+          <w:p>
+            <w:r>
+              <w:rPr>
+                <w:b/>
+                <w:sz w:val="18"/>
+              </w:rPr>
+            </w:r>
+            <w:r>
+              <w:rPr>
+                <w:b/>
+                <w:sz w:val="18"/>
+              </w:rPr>
+              <w:t>Constraint</w:t>
+            </w:r>
+          </w:p>
+        </w:tc>
+        <w:tc>
+          <w:tcPr>
+            <w:tcW w:type="dxa" w:w="2880"/>
+          </w:tcPr>
+          <w:p>
+            <w:r>
+              <w:rPr>
+                <w:b/>
+                <w:sz w:val="18"/>
+              </w:rPr>
+            </w:r>
+            <w:r>
+              <w:rPr>
+                <w:b/>
+                <w:sz w:val="18"/>
+              </w:rPr>
+              <w:t>Why</w:t>
+            </w:r>
+          </w:p>
+        </w:tc>
+      </w:tr>
+      <w:tr>
+        <w:tc>
+          <w:tcPr>
+            <w:tcW w:type="dxa" w:w="2880"/>
+          </w:tcPr>
+          <w:p>
+            <w:r>
+              <w:rPr>
+                <w:sz w:val="18"/>
+              </w:rPr>
+            </w:r>
+            <w:r>
+              <w:rPr>
+                <w:rFonts w:ascii="Consolas" w:hAnsi="Consolas"/>
+                <w:color w:val="B03060"/>
+                <w:sz w:val="18"/>
+              </w:rPr>
+              <w:t>scikit-learn</w:t>
+            </w:r>
+            <w:r>
+              <w:rPr>
+                <w:sz w:val="18"/>
+              </w:rPr>
+              <w:t xml:space="preserve">, </w:t>
+            </w:r>
+            <w:r>
+              <w:rPr>
+                <w:rFonts w:ascii="Consolas" w:hAnsi="Consolas"/>
+                <w:color w:val="B03060"/>
+                <w:sz w:val="18"/>
+              </w:rPr>
+              <w:t>numpy</w:t>
+            </w:r>
+            <w:r>
+              <w:rPr>
+                <w:sz w:val="18"/>
+              </w:rPr>
+              <w:t xml:space="preserve">, </w:t>
+            </w:r>
+            <w:r>
+              <w:rPr>
+                <w:rFonts w:ascii="Consolas" w:hAnsi="Consolas"/>
+                <w:color w:val="B03060"/>
+                <w:sz w:val="18"/>
+              </w:rPr>
+              <w:t>scipy</w:t>
+            </w:r>
+            <w:r>
+              <w:rPr>
+                <w:sz w:val="18"/>
+              </w:rPr>
+              <w:t xml:space="preserve">, </w:t>
+            </w:r>
+            <w:r>
+              <w:rPr>
+                <w:rFonts w:ascii="Consolas" w:hAnsi="Consolas"/>
+                <w:color w:val="B03060"/>
+                <w:sz w:val="18"/>
+              </w:rPr>
+              <w:t>joblib</w:t>
+            </w:r>
+          </w:p>
+        </w:tc>
+        <w:tc>
+          <w:tcPr>
+            <w:tcW w:type="dxa" w:w="2880"/>
+          </w:tcPr>
+          <w:p>
+            <w:r>
+              <w:rPr>
+                <w:sz w:val="18"/>
+              </w:rPr>
+            </w:r>
+            <w:r>
+              <w:rPr>
+                <w:b/>
+                <w:sz w:val="18"/>
+              </w:rPr>
+              <w:t>`==` exact</w:t>
+            </w:r>
+          </w:p>
+        </w:tc>
+        <w:tc>
+          <w:tcPr>
+            <w:tcW w:type="dxa" w:w="2880"/>
+          </w:tcPr>
+          <w:p>
+            <w:r>
+              <w:rPr>
+                <w:sz w:val="18"/>
+              </w:rPr>
+            </w:r>
+            <w:r>
+              <w:rPr>
+                <w:sz w:val="18"/>
+              </w:rPr>
+              <w:t xml:space="preserve">These unpickle the model. A minor bump can change an estimator's internal layout, and the failure mode is the worst available: the image builds, the container starts, </w:t>
+            </w:r>
+            <w:r>
+              <w:rPr>
+                <w:rFonts w:ascii="Consolas" w:hAnsi="Consolas"/>
+                <w:color w:val="B03060"/>
+                <w:sz w:val="18"/>
+              </w:rPr>
+              <w:t>/health</w:t>
+            </w:r>
+            <w:r>
+              <w:rPr>
+                <w:sz w:val="18"/>
+              </w:rPr>
+              <w:t xml:space="preserve"> passes, and the </w:t>
+            </w:r>
+            <w:r>
+              <w:rPr>
+                <w:b/>
+                <w:sz w:val="18"/>
+              </w:rPr>
+              <w:t>first prediction</w:t>
+            </w:r>
+            <w:r>
+              <w:rPr>
+                <w:sz w:val="18"/>
+              </w:rPr>
+              <w:t xml:space="preserve"> fails</w:t>
+            </w:r>
+          </w:p>
+        </w:tc>
+      </w:tr>
+      <w:tr>
+        <w:tc>
+          <w:tcPr>
+            <w:tcW w:type="dxa" w:w="2880"/>
+          </w:tcPr>
+          <w:p>
+            <w:r>
+              <w:rPr>
+                <w:sz w:val="18"/>
+              </w:rPr>
+            </w:r>
+            <w:r>
+              <w:rPr>
+                <w:rFonts w:ascii="Consolas" w:hAnsi="Consolas"/>
+                <w:color w:val="B03060"/>
+                <w:sz w:val="18"/>
+              </w:rPr>
+              <w:t>pandas</w:t>
+            </w:r>
+          </w:p>
+        </w:tc>
+        <w:tc>
+          <w:tcPr>
+            <w:tcW w:type="dxa" w:w="2880"/>
+          </w:tcPr>
+          <w:p>
+            <w:r>
+              <w:rPr>
+                <w:sz w:val="18"/>
+              </w:rPr>
+            </w:r>
+            <w:r>
+              <w:rPr>
+                <w:rFonts w:ascii="Consolas" w:hAnsi="Consolas"/>
+                <w:color w:val="B03060"/>
+                <w:sz w:val="18"/>
+              </w:rPr>
+              <w:t>~=</w:t>
+            </w:r>
+            <w:r>
+              <w:rPr>
+                <w:sz w:val="18"/>
+              </w:rPr>
+              <w:t xml:space="preserve"> compatible</w:t>
+            </w:r>
+          </w:p>
+        </w:tc>
+        <w:tc>
+          <w:tcPr>
+            <w:tcW w:type="dxa" w:w="2880"/>
+          </w:tcPr>
+          <w:p>
+            <w:r>
+              <w:rPr>
+                <w:sz w:val="18"/>
+              </w:rPr>
+            </w:r>
+            <w:r>
+              <w:rPr>
+                <w:sz w:val="18"/>
+              </w:rPr>
+              <w:t>Used by the feature adapter, not by the pickle</w:t>
+            </w:r>
+          </w:p>
+        </w:tc>
+      </w:tr>
+      <w:tr>
+        <w:tc>
+          <w:tcPr>
+            <w:tcW w:type="dxa" w:w="2880"/>
+          </w:tcPr>
+          <w:p>
+            <w:r>
+              <w:rPr>
+                <w:sz w:val="18"/>
+              </w:rPr>
+            </w:r>
+            <w:r>
+              <w:rPr>
+                <w:rFonts w:ascii="Consolas" w:hAnsi="Consolas"/>
+                <w:color w:val="B03060"/>
+                <w:sz w:val="18"/>
+              </w:rPr>
+              <w:t>fastapi</w:t>
+            </w:r>
+            <w:r>
+              <w:rPr>
+                <w:sz w:val="18"/>
+              </w:rPr>
+              <w:t xml:space="preserve">, </w:t>
+            </w:r>
+            <w:r>
+              <w:rPr>
+                <w:rFonts w:ascii="Consolas" w:hAnsi="Consolas"/>
+                <w:color w:val="B03060"/>
+                <w:sz w:val="18"/>
+              </w:rPr>
+              <w:t>uvicorn</w:t>
+            </w:r>
+            <w:r>
+              <w:rPr>
+                <w:sz w:val="18"/>
+              </w:rPr>
+              <w:t xml:space="preserve">, </w:t>
+            </w:r>
+            <w:r>
+              <w:rPr>
+                <w:rFonts w:ascii="Consolas" w:hAnsi="Consolas"/>
+                <w:color w:val="B03060"/>
+                <w:sz w:val="18"/>
+              </w:rPr>
+              <w:t>pydantic</w:t>
+            </w:r>
+          </w:p>
+        </w:tc>
+        <w:tc>
+          <w:tcPr>
+            <w:tcW w:type="dxa" w:w="2880"/>
+          </w:tcPr>
+          <w:p>
+            <w:r>
+              <w:rPr>
+                <w:sz w:val="18"/>
+              </w:rPr>
+            </w:r>
+            <w:r>
+              <w:rPr>
+                <w:rFonts w:ascii="Consolas" w:hAnsi="Consolas"/>
+                <w:color w:val="B03060"/>
+                <w:sz w:val="18"/>
+              </w:rPr>
+              <w:t>&gt;=,&lt;</w:t>
+            </w:r>
+            <w:r>
+              <w:rPr>
+                <w:sz w:val="18"/>
+              </w:rPr>
+              <w:t xml:space="preserve"> ranges</w:t>
+            </w:r>
+          </w:p>
+        </w:tc>
+        <w:tc>
+          <w:tcPr>
+            <w:tcW w:type="dxa" w:w="2880"/>
+          </w:tcPr>
+          <w:p>
+            <w:r>
+              <w:rPr>
+                <w:sz w:val="18"/>
+              </w:rPr>
+            </w:r>
+            <w:r>
+              <w:rPr>
+                <w:sz w:val="18"/>
+              </w:rPr>
+              <w:t>The HTTP layer never touches the artifact. Pinning it exactly buys no safety and declines security patches in the component most exposed to the internet</w:t>
+            </w:r>
+          </w:p>
+        </w:tc>
+      </w:tr>
+    </w:tbl>
+    <w:p/>
+    <w:p>
+      <w:r>
+        <w:t xml:space="preserve">The container also runs </w:t>
+      </w:r>
+      <w:r>
+        <w:rPr>
+          <w:b/>
+        </w:rPr>
+        <w:t>Python 3.12</w:t>
+      </w:r>
+      <w:r>
+        <w:t xml:space="preserve"> to match the interpreter that produced </w:t>
+      </w:r>
+      <w:r>
+        <w:rPr>
+          <w:rFonts w:ascii="Consolas" w:hAnsi="Consolas"/>
+          <w:color w:val="B03060"/>
+          <w:sz w:val="19"/>
+        </w:rPr>
+        <w:t>artifacts/model.pkl</w:t>
+      </w:r>
+      <w:r>
+        <w:t>. Serving on 3.11 while training on 3.12 worked, but by luck rather than design — a pickle carries references to the classes that created it.</w:t>
+      </w:r>
+    </w:p>
+    <w:p>
+      <w:r>
+        <w:rPr>
+          <w:rFonts w:ascii="Consolas" w:hAnsi="Consolas"/>
+          <w:color w:val="B03060"/>
+          <w:sz w:val="19"/>
+        </w:rPr>
+        <w:t>metrics.json</w:t>
+      </w:r>
+      <w:r>
+        <w:t xml:space="preserve"> records these versions in an </w:t>
+      </w:r>
+      <w:r>
+        <w:rPr>
+          <w:rFonts w:ascii="Consolas" w:hAnsi="Consolas"/>
+          <w:color w:val="B03060"/>
+          <w:sz w:val="19"/>
+        </w:rPr>
+        <w:t>environment</w:t>
+      </w:r>
+      <w:r>
+        <w:t xml:space="preserve"> block. That duplicates the artifact deliberately: reading them from the artifact requires unpickling it, which needs the very libraries you are trying to identify — circular exactly when it matters.</w:t>
       </w:r>
     </w:p>
     <w:p>
@@ -26726,15 +29101,19 @@
         <w:br/>
         <w:t>│       └── train.py          # training CLI</w:t>
         <w:br/>
-        <w:t>├── frontend/app.py           # Streamlit UI</w:t>
+        <w:t>├── frontend/app.py           # Streamlit UI - a thin client, no business logic</w:t>
         <w:br/>
-        <w:t>├── tests/                    # unit + API tests</w:t>
+        <w:t>├── tests/                    # 402 tests across 17 modules</w:t>
         <w:br/>
-        <w:t>├── docs/                     # architecture.md, validation_plan.md, model_card.md</w:t>
+        <w:t>├── docs/                     # architecture.md, validation_plan.md, model_card.md, WALKTHROUGH.md</w:t>
         <w:br/>
-        <w:t>├── notebooks/01_analysis.ipynb   # the analysis narrative, reproducible end to end</w:t>
+        <w:t>├── notebooks/</w:t>
         <w:br/>
-        <w:t>├── reports/                  # REPORT.md, findings.json, figures/</w:t>
+        <w:t>│   ├── 01_analysis.ipynb     # the analysis narrative, reproducible end to end</w:t>
+        <w:br/>
+        <w:t>│   └── analysis_support.py   # presentation helpers - NOT in src/, see below</w:t>
+        <w:br/>
+        <w:t>├── reports/                  # REPORT.md, findings.json, figures/, PEER_REVIEW_SUMMARY.md</w:t>
         <w:br/>
         <w:t>├── artifacts/                # model.pkl, metrics.json (git-ignored)</w:t>
         <w:br/>
@@ -26742,7 +29121,168 @@
         <w:br/>
         <w:t>├── Dockerfile / Dockerfile.frontend / cloudbuild.frontend.yaml</w:t>
         <w:br/>
-        <w:t>└── .github/workflows/ci.yml</w:t>
+        <w:t>├── terraform/                # Cloud Run, IAM, Artifact Registry</w:t>
+        <w:br/>
+        <w:t>└── .github/workflows/        # ci.yml (push/PR) + deploy.yml (manual)</w:t>
+      </w:r>
+    </w:p>
+    <w:p>
+      <w:r>
+        <w:rPr>
+          <w:b/>
+        </w:rPr>
+        <w:t>Why `analysis_support.py` sits in `notebooks/` and not `src/`.</w:t>
+      </w:r>
+      <w:r>
+        <w:t xml:space="preserve"> It holds the notebook's presentation helpers — table formatting, chart assembly — and imports matplotlib, seaborn and </w:t>
+      </w:r>
+      <w:r>
+        <w:rPr>
+          <w:rFonts w:ascii="Consolas" w:hAnsi="Consolas"/>
+          <w:color w:val="B03060"/>
+          <w:sz w:val="19"/>
+        </w:rPr>
+        <w:t>IPython.display</w:t>
+      </w:r>
+      <w:r>
+        <w:t>. Three consequences follow, in order of how much they matter:</w:t>
+      </w:r>
+    </w:p>
+    <w:p>
+      <w:pPr>
+        <w:pStyle w:val="ListNumber"/>
+      </w:pPr>
+      <w:r>
+        <w:rPr>
+          <w:rFonts w:ascii="Consolas" w:hAnsi="Consolas"/>
+          <w:color w:val="B03060"/>
+          <w:sz w:val="19"/>
+        </w:rPr>
+        <w:t>src/</w:t>
+      </w:r>
+      <w:r>
+        <w:t xml:space="preserve"> is the </w:t>
+      </w:r>
+      <w:r>
+        <w:rPr>
+          <w:b/>
+        </w:rPr>
+        <w:t>deployed</w:t>
+      </w:r>
+      <w:r>
+        <w:t xml:space="preserve"> package. </w:t>
+      </w:r>
+      <w:r>
+        <w:rPr>
+          <w:rFonts w:ascii="Consolas" w:hAnsi="Consolas"/>
+          <w:color w:val="B03060"/>
+          <w:sz w:val="19"/>
+        </w:rPr>
+        <w:t>requirements-serve.txt</w:t>
+      </w:r>
+      <w:r>
+        <w:t xml:space="preserve"> ships scikit-learn, pandas and</w:t>
+      </w:r>
+    </w:p>
+    <w:p>
+      <w:r>
+        <w:t xml:space="preserve">FastAPI and nothing else. If these helpers lived in </w:t>
+      </w:r>
+      <w:r>
+        <w:rPr>
+          <w:rFonts w:ascii="Consolas" w:hAnsi="Consolas"/>
+          <w:color w:val="B03060"/>
+          <w:sz w:val="19"/>
+        </w:rPr>
+        <w:t>src/</w:t>
+      </w:r>
+      <w:r>
+        <w:t>, the API could import a dependency the container does not have — a failure that appears only at runtime, in production.</w:t>
+      </w:r>
+    </w:p>
+    <w:p>
+      <w:pPr>
+        <w:pStyle w:val="ListNumber"/>
+      </w:pPr>
+      <w:r>
+        <w:t xml:space="preserve">Coverage is measured on </w:t>
+      </w:r>
+      <w:r>
+        <w:rPr>
+          <w:rFonts w:ascii="Consolas" w:hAnsi="Consolas"/>
+          <w:color w:val="B03060"/>
+          <w:sz w:val="19"/>
+        </w:rPr>
+        <w:t>src/</w:t>
+      </w:r>
+      <w:r>
+        <w:t xml:space="preserve"> against a </w:t>
+      </w:r>
+      <w:r>
+        <w:rPr>
+          <w:rFonts w:ascii="Consolas" w:hAnsi="Consolas"/>
+          <w:color w:val="B03060"/>
+          <w:sz w:val="19"/>
+        </w:rPr>
+        <w:t>fail_under</w:t>
+      </w:r>
+      <w:r>
+        <w:t xml:space="preserve"> floor. Adding several hundred lines</w:t>
+      </w:r>
+    </w:p>
+    <w:p>
+      <w:r>
+        <w:t>of chart formatting would either break the gate or force tests asserting the colour of a heatmap.</w:t>
+      </w:r>
+    </w:p>
+    <w:p>
+      <w:pPr>
+        <w:pStyle w:val="ListNumber"/>
+      </w:pPr>
+      <w:r>
+        <w:rPr>
+          <w:rFonts w:ascii="Consolas" w:hAnsi="Consolas"/>
+          <w:color w:val="B03060"/>
+          <w:sz w:val="19"/>
+        </w:rPr>
+        <w:t>.gcloudignore</w:t>
+      </w:r>
+      <w:r>
+        <w:t xml:space="preserve"> excludes </w:t>
+      </w:r>
+      <w:r>
+        <w:rPr>
+          <w:rFonts w:ascii="Consolas" w:hAnsi="Consolas"/>
+          <w:color w:val="B03060"/>
+          <w:sz w:val="19"/>
+        </w:rPr>
+        <w:t>notebooks/</w:t>
+      </w:r>
+      <w:r>
+        <w:t>, so none of it reaches the serving image.</w:t>
+      </w:r>
+    </w:p>
+    <w:p>
+      <w:r>
+        <w:t xml:space="preserve">The boundary is </w:t>
+      </w:r>
+      <w:r>
+        <w:rPr>
+          <w:i/>
+        </w:rPr>
+        <w:t>product code versus analysis code</w:t>
+      </w:r>
+      <w:r>
+        <w:t xml:space="preserve">, not </w:t>
+      </w:r>
+      <w:r>
+        <w:rPr>
+          <w:i/>
+        </w:rPr>
+        <w:t>importable Python versus scripts</w:t>
+      </w:r>
+      <w:r>
+        <w:t>.</w:t>
       </w:r>
     </w:p>
     <w:p>
@@ -29397,7 +31937,7 @@
     </w:p>
     <w:p>
       <w:r>
-        <w:t xml:space="preserve">All 20 / 20 / 27 keys are required. Missing, unexpected, or post-campaign keys return </w:t>
+        <w:t xml:space="preserve">All 20 / 20 / 27 keys are required. The schema rejects, with </w:t>
       </w:r>
       <w:r>
         <w:rPr>
@@ -29408,7 +31948,447 @@
         <w:t>422</w:t>
       </w:r>
       <w:r>
-        <w:t xml:space="preserve"> with an explanatory </w:t>
+        <w:t xml:space="preserve"> and a reason naming the offending field:</w:t>
+      </w:r>
+    </w:p>
+    <w:tbl>
+      <w:tblPr>
+        <w:tblStyle w:val="LightGrid-Accent1"/>
+        <w:tblW w:type="auto" w:w="0"/>
+        <w:tblLook w:firstColumn="1" w:firstRow="1" w:lastColumn="0" w:lastRow="0" w:noHBand="0" w:noVBand="1" w:val="04A0"/>
+      </w:tblPr>
+      <w:tblGrid>
+        <w:gridCol w:w="2160"/>
+        <w:gridCol w:w="2160"/>
+        <w:gridCol w:w="2160"/>
+        <w:gridCol w:w="2160"/>
+      </w:tblGrid>
+      <w:tr>
+        <w:tc>
+          <w:tcPr>
+            <w:tcW w:type="dxa" w:w="2160"/>
+          </w:tcPr>
+          <w:p>
+            <w:r>
+              <w:rPr>
+                <w:b/>
+                <w:sz w:val="18"/>
+              </w:rPr>
+            </w:r>
+            <w:r>
+              <w:rPr>
+                <w:b/>
+                <w:sz w:val="18"/>
+              </w:rPr>
+              <w:t>Input</w:t>
+            </w:r>
+          </w:p>
+        </w:tc>
+        <w:tc>
+          <w:tcPr>
+            <w:tcW w:type="dxa" w:w="2160"/>
+          </w:tcPr>
+          <w:p>
+            <w:r>
+              <w:rPr>
+                <w:b/>
+                <w:sz w:val="18"/>
+              </w:rPr>
+            </w:r>
+            <w:r>
+              <w:rPr>
+                <w:b/>
+                <w:sz w:val="18"/>
+              </w:rPr>
+              <w:t>Why</w:t>
+            </w:r>
+          </w:p>
+        </w:tc>
+        <w:tc>
+          <w:tcPr>
+            <w:tcW w:type="dxa" w:w="2160"/>
+          </w:tcPr>
+          <w:p>
+            <w:r>
+              <w:rPr>
+                <w:b/>
+                <w:sz w:val="18"/>
+              </w:rPr>
+            </w:r>
+          </w:p>
+        </w:tc>
+        <w:tc>
+          <w:tcPr>
+            <w:tcW w:type="dxa" w:w="2160"/>
+          </w:tcPr>
+          <w:p>
+            <w:r>
+              <w:rPr>
+                <w:b/>
+                <w:sz w:val="18"/>
+              </w:rPr>
+            </w:r>
+          </w:p>
+        </w:tc>
+      </w:tr>
+      <w:tr>
+        <w:tc>
+          <w:tcPr>
+            <w:tcW w:type="dxa" w:w="2160"/>
+          </w:tcPr>
+          <w:p>
+            <w:r>
+              <w:rPr>
+                <w:sz w:val="18"/>
+              </w:rPr>
+            </w:r>
+            <w:r>
+              <w:rPr>
+                <w:sz w:val="18"/>
+              </w:rPr>
+              <w:t>Missing, unexpected, or post-campaign keys</w:t>
+            </w:r>
+          </w:p>
+        </w:tc>
+        <w:tc>
+          <w:tcPr>
+            <w:tcW w:type="dxa" w:w="2160"/>
+          </w:tcPr>
+          <w:p>
+            <w:r>
+              <w:rPr>
+                <w:sz w:val="18"/>
+              </w:rPr>
+            </w:r>
+            <w:r>
+              <w:rPr>
+                <w:sz w:val="18"/>
+              </w:rPr>
+              <w:t xml:space="preserve">The contract is exact; a silently ignored </w:t>
+            </w:r>
+            <w:r>
+              <w:rPr>
+                <w:rFonts w:ascii="Consolas" w:hAnsi="Consolas"/>
+                <w:color w:val="B03060"/>
+                <w:sz w:val="18"/>
+              </w:rPr>
+              <w:t>g1_21</w:t>
+            </w:r>
+            <w:r>
+              <w:rPr>
+                <w:sz w:val="18"/>
+              </w:rPr>
+              <w:t xml:space="preserve"> would let a caller believe a post-campaign value was used</w:t>
+            </w:r>
+          </w:p>
+        </w:tc>
+        <w:tc>
+          <w:tcPr>
+            <w:tcW w:type="dxa" w:w="2160"/>
+          </w:tcPr>
+          <w:p>
+            <w:r>
+              <w:rPr>
+                <w:sz w:val="18"/>
+              </w:rPr>
+            </w:r>
+          </w:p>
+        </w:tc>
+        <w:tc>
+          <w:tcPr>
+            <w:tcW w:type="dxa" w:w="2160"/>
+          </w:tcPr>
+          <w:p>
+            <w:r>
+              <w:rPr>
+                <w:sz w:val="18"/>
+              </w:rPr>
+            </w:r>
+          </w:p>
+        </w:tc>
+      </w:tr>
+      <w:tr>
+        <w:tc>
+          <w:tcPr>
+            <w:tcW w:type="dxa" w:w="2160"/>
+          </w:tcPr>
+          <w:p>
+            <w:r>
+              <w:rPr>
+                <w:sz w:val="18"/>
+              </w:rPr>
+            </w:r>
+            <w:r>
+              <w:rPr>
+                <w:rFonts w:ascii="Consolas" w:hAnsi="Consolas"/>
+                <w:color w:val="B03060"/>
+                <w:sz w:val="18"/>
+              </w:rPr>
+              <w:t>NaN</w:t>
+            </w:r>
+          </w:p>
+        </w:tc>
+        <w:tc>
+          <w:tcPr>
+            <w:tcW w:type="dxa" w:w="2160"/>
+          </w:tcPr>
+          <w:p>
+            <w:r>
+              <w:rPr>
+                <w:sz w:val="18"/>
+              </w:rPr>
+            </w:r>
+            <w:r>
+              <w:rPr>
+                <w:sz w:val="18"/>
+              </w:rPr>
+              <w:t xml:space="preserve">Indistinguishable from </w:t>
+            </w:r>
+            <w:r>
+              <w:rPr>
+                <w:rFonts w:ascii="Consolas" w:hAnsi="Consolas"/>
+                <w:color w:val="B03060"/>
+                <w:sz w:val="18"/>
+              </w:rPr>
+              <w:t>null</w:t>
+            </w:r>
+            <w:r>
+              <w:rPr>
+                <w:sz w:val="18"/>
+              </w:rPr>
+              <w:t xml:space="preserve"> downstream but arrives by a different path — usually a failed upstream computation. A caller should have one </w:t>
+            </w:r>
+            <w:r>
+              <w:rPr>
+                <w:i/>
+                <w:sz w:val="18"/>
+              </w:rPr>
+              <w:t>deliberate</w:t>
+            </w:r>
+            <w:r>
+              <w:rPr>
+                <w:sz w:val="18"/>
+              </w:rPr>
+              <w:t xml:space="preserve"> way to say "no value"</w:t>
+            </w:r>
+          </w:p>
+        </w:tc>
+        <w:tc>
+          <w:tcPr>
+            <w:tcW w:type="dxa" w:w="2160"/>
+          </w:tcPr>
+          <w:p>
+            <w:r>
+              <w:rPr>
+                <w:sz w:val="18"/>
+              </w:rPr>
+            </w:r>
+          </w:p>
+        </w:tc>
+        <w:tc>
+          <w:tcPr>
+            <w:tcW w:type="dxa" w:w="2160"/>
+          </w:tcPr>
+          <w:p>
+            <w:r>
+              <w:rPr>
+                <w:sz w:val="18"/>
+              </w:rPr>
+            </w:r>
+          </w:p>
+        </w:tc>
+      </w:tr>
+      <w:tr>
+        <w:tc>
+          <w:tcPr>
+            <w:tcW w:type="dxa" w:w="2160"/>
+          </w:tcPr>
+          <w:p>
+            <w:r>
+              <w:rPr>
+                <w:sz w:val="18"/>
+              </w:rPr>
+            </w:r>
+            <w:r>
+              <w:rPr>
+                <w:rFonts w:ascii="Consolas" w:hAnsi="Consolas"/>
+                <w:color w:val="B03060"/>
+                <w:sz w:val="18"/>
+              </w:rPr>
+              <w:t>±inf</w:t>
+            </w:r>
+            <w:r>
+              <w:rPr>
+                <w:sz w:val="18"/>
+              </w:rPr>
+              <w:t>, or `\</w:t>
+            </w:r>
+          </w:p>
+        </w:tc>
+        <w:tc>
+          <w:tcPr>
+            <w:tcW w:type="dxa" w:w="2160"/>
+          </w:tcPr>
+          <w:p>
+            <w:r>
+              <w:rPr>
+                <w:sz w:val="18"/>
+              </w:rPr>
+            </w:r>
+            <w:r>
+              <w:rPr>
+                <w:sz w:val="18"/>
+              </w:rPr>
+              <w:t>value\</w:t>
+            </w:r>
+          </w:p>
+        </w:tc>
+        <w:tc>
+          <w:tcPr>
+            <w:tcW w:type="dxa" w:w="2160"/>
+          </w:tcPr>
+          <w:p>
+            <w:r>
+              <w:rPr>
+                <w:sz w:val="18"/>
+              </w:rPr>
+            </w:r>
+            <w:r>
+              <w:rPr>
+                <w:sz w:val="18"/>
+              </w:rPr>
+              <w:t>&gt; 1e6`</w:t>
+            </w:r>
+          </w:p>
+        </w:tc>
+        <w:tc>
+          <w:tcPr>
+            <w:tcW w:type="dxa" w:w="2160"/>
+          </w:tcPr>
+          <w:p>
+            <w:r>
+              <w:rPr>
+                <w:sz w:val="18"/>
+              </w:rPr>
+            </w:r>
+            <w:r>
+              <w:rPr>
+                <w:sz w:val="18"/>
+              </w:rPr>
+              <w:t xml:space="preserve">Finite-but-implausible values pass every type check and overflow during standardisation. Without this the caller receives a </w:t>
+            </w:r>
+            <w:r>
+              <w:rPr>
+                <w:rFonts w:ascii="Consolas" w:hAnsi="Consolas"/>
+                <w:color w:val="B03060"/>
+                <w:sz w:val="18"/>
+              </w:rPr>
+              <w:t>500</w:t>
+            </w:r>
+            <w:r>
+              <w:rPr>
+                <w:sz w:val="18"/>
+              </w:rPr>
+              <w:t xml:space="preserve"> for what is unambiguously a client error</w:t>
+            </w:r>
+          </w:p>
+        </w:tc>
+      </w:tr>
+      <w:tr>
+        <w:tc>
+          <w:tcPr>
+            <w:tcW w:type="dxa" w:w="2160"/>
+          </w:tcPr>
+          <w:p>
+            <w:r>
+              <w:rPr>
+                <w:sz w:val="18"/>
+              </w:rPr>
+            </w:r>
+            <w:r>
+              <w:rPr>
+                <w:sz w:val="18"/>
+              </w:rPr>
+              <w:t xml:space="preserve">More than </w:t>
+            </w:r>
+            <w:r>
+              <w:rPr>
+                <w:b/>
+                <w:sz w:val="18"/>
+              </w:rPr>
+              <w:t>20%</w:t>
+            </w:r>
+            <w:r>
+              <w:rPr>
+                <w:sz w:val="18"/>
+              </w:rPr>
+              <w:t xml:space="preserve"> of the 67 features </w:t>
+            </w:r>
+            <w:r>
+              <w:rPr>
+                <w:rFonts w:ascii="Consolas" w:hAnsi="Consolas"/>
+                <w:color w:val="B03060"/>
+                <w:sz w:val="18"/>
+              </w:rPr>
+              <w:t>null</w:t>
+            </w:r>
+          </w:p>
+        </w:tc>
+        <w:tc>
+          <w:tcPr>
+            <w:tcW w:type="dxa" w:w="2160"/>
+          </w:tcPr>
+          <w:p>
+            <w:r>
+              <w:rPr>
+                <w:sz w:val="18"/>
+              </w:rPr>
+            </w:r>
+            <w:r>
+              <w:rPr>
+                <w:sz w:val="18"/>
+              </w:rPr>
+              <w:t xml:space="preserve">The median imputer fills every gap confidently, so a request of 67 nulls would return a well-formed prediction with a confidence score — built entirely from training medians. </w:t>
+            </w:r>
+            <w:r>
+              <w:rPr>
+                <w:b/>
+                <w:sz w:val="18"/>
+              </w:rPr>
+              <w:t>A campaign must never be approved from an empty request</w:t>
+            </w:r>
+          </w:p>
+        </w:tc>
+        <w:tc>
+          <w:tcPr>
+            <w:tcW w:type="dxa" w:w="2160"/>
+          </w:tcPr>
+          <w:p>
+            <w:r>
+              <w:rPr>
+                <w:sz w:val="18"/>
+              </w:rPr>
+            </w:r>
+          </w:p>
+        </w:tc>
+        <w:tc>
+          <w:tcPr>
+            <w:tcW w:type="dxa" w:w="2160"/>
+          </w:tcPr>
+          <w:p>
+            <w:r>
+              <w:rPr>
+                <w:sz w:val="18"/>
+              </w:rPr>
+            </w:r>
+          </w:p>
+        </w:tc>
+      </w:tr>
+    </w:tbl>
+    <w:p/>
+    <w:p>
+      <w:r>
+        <w:t xml:space="preserve">A </w:t>
       </w:r>
       <w:r>
         <w:rPr>
@@ -29416,21 +32396,36 @@
           <w:color w:val="B03060"/>
           <w:sz w:val="19"/>
         </w:rPr>
-        <w:t>detail</w:t>
-      </w:r>
-      <w:r>
-        <w:t xml:space="preserve">. A </w:t>
-      </w:r>
+        <w:t>null</w:t>
+      </w:r>
+      <w:r>
+        <w:t xml:space="preserve"> value is accepted and imputed </w:t>
+      </w:r>
+      <w:r>
+        <w:rPr>
+          <w:b/>
+        </w:rPr>
+        <w:t>below</w:t>
+      </w:r>
+      <w:r>
+        <w:t xml:space="preserve"> that threshold; sparse gaps are what the imputer is for.</w:t>
+      </w:r>
+    </w:p>
+    <w:p>
+      <w:pPr>
+        <w:spacing w:after="200"/>
+        <w:ind w:left="360"/>
+      </w:pPr>
       <w:r>
         <w:rPr>
           <w:rFonts w:ascii="Consolas" w:hAnsi="Consolas"/>
-          <w:color w:val="B03060"/>
-          <w:sz w:val="19"/>
-        </w:rPr>
-        <w:t>null</w:t>
-      </w:r>
-      <w:r>
-        <w:t xml:space="preserve"> value is accepted and imputed.</w:t>
+          <w:sz w:val="18"/>
+        </w:rPr>
+        <w:t># Verifiable against the live service:</w:t>
+        <w:br/>
+        <w:t>#   422 - "67 of 67 features are null, above the limit of 13 (20%)"</w:t>
+        <w:br/>
+        <w:t>#   422 - "g1_1 = 1e+308 exceeds the plausible range (|value| &lt;= 1e+06)"</w:t>
       </w:r>
     </w:p>
     <w:p>
@@ -30040,20 +33035,34 @@
               <w:rPr>
                 <w:sz w:val="18"/>
               </w:rPr>
-              <w:t xml:space="preserve">Asserts the confidential dataset is absent from the tree </w:t>
+              <w:t xml:space="preserve">Runs </w:t>
+            </w:r>
+            <w:r>
+              <w:rPr>
+                <w:rFonts w:ascii="Consolas" w:hAnsi="Consolas"/>
+                <w:color w:val="B03060"/>
+                <w:sz w:val="18"/>
+              </w:rPr>
+              <w:t>scripts/check_no_data_committed.py</w:t>
+            </w:r>
+            <w:r>
+              <w:rPr>
+                <w:sz w:val="18"/>
+              </w:rPr>
+              <w:t xml:space="preserve">, which refuses a commit whose </w:t>
             </w:r>
             <w:r>
               <w:rPr>
                 <w:b/>
                 <w:sz w:val="18"/>
               </w:rPr>
-              <w:t>and from git history</w:t>
-            </w:r>
-            <w:r>
-              <w:rPr>
-                <w:sz w:val="18"/>
-              </w:rPr>
-              <w:t>. Runs first — if this fails, no other result matters</w:t>
+              <w:t>staged</w:t>
+            </w:r>
+            <w:r>
+              <w:rPr>
+                <w:sz w:val="18"/>
+              </w:rPr>
+              <w:t xml:space="preserve"> changes include the dataset or another blocked path. Runs first — if this fails, no other result matters</w:t>
             </w:r>
           </w:p>
         </w:tc>
@@ -30376,21 +33385,218 @@
           <w:rFonts w:ascii="Consolas" w:hAnsi="Consolas"/>
           <w:sz w:val="18"/>
         </w:rPr>
-        <w:t>pytest                       # full suite with coverage</w:t>
+        <w:t>pytest                                  # full suite with the coverage floor</w:t>
         <w:br/>
-        <w:t>pytest tests/test_api.py -v  # one module</w:t>
+        <w:t>pytest tests/test_api.py -v --no-cov    # one module (--no-cov: 30 tests cannot reach 90%)</w:t>
         <w:br/>
         <w:t>pytest --cov=src --cov-report=html &amp;&amp; open htmlcov/index.html</w:t>
       </w:r>
     </w:p>
     <w:p>
       <w:r>
-        <w:t>Covered: feature engineering arithmetic, leakage removal, payload validation and every rejection path, predictor strategies, artifact loading and corruption handling, factory registration, registry singleton semantics and fallback behaviour, evaluation and lift maths, and all API endpoints including error codes.</w:t>
-      </w:r>
-    </w:p>
-    <w:p>
-      <w:r>
-        <w:t>Tests use a small synthetic dataset with the real column contract, so the suite is fast, deterministic, and ships no proprietary data.</w:t>
+        <w:rPr>
+          <w:b/>
+        </w:rPr>
+        <w:t>402 tests across 17 modules, 92.4% branch coverage</w:t>
+      </w:r>
+      <w:r>
+        <w:t xml:space="preserve"> against </w:t>
+      </w:r>
+      <w:r>
+        <w:rPr>
+          <w:rFonts w:ascii="Consolas" w:hAnsi="Consolas"/>
+          <w:color w:val="B03060"/>
+          <w:sz w:val="19"/>
+        </w:rPr>
+        <w:t>fail_under = 90</w:t>
+      </w:r>
+      <w:r>
+        <w:t xml:space="preserve"> in </w:t>
+      </w:r>
+      <w:r>
+        <w:rPr>
+          <w:rFonts w:ascii="Consolas" w:hAnsi="Consolas"/>
+          <w:color w:val="B03060"/>
+          <w:sz w:val="19"/>
+        </w:rPr>
+        <w:t>pyproject.toml</w:t>
+      </w:r>
+      <w:r>
+        <w:t xml:space="preserve"> — so the gate behaves identically on a laptop and in CI.</w:t>
+      </w:r>
+    </w:p>
+    <w:p>
+      <w:r>
+        <w:t>Covered: feature engineering arithmetic, leakage removal, payload validation and every rejection path, predictor strategies, artifact loading and corruption handling, factory registration, registry semantics and fallback behaviour, evaluation and lift maths, structured logging, tracking degradation, and all API endpoints including error codes.</w:t>
+      </w:r>
+    </w:p>
+    <w:p>
+      <w:r>
+        <w:t xml:space="preserve">Tests use a small synthetic dataset with the real column contract, so the suite is fast, deterministic, and ships no proprietary data. That is not only convenience — the real dataset is never committed, so </w:t>
+      </w:r>
+      <w:r>
+        <w:rPr>
+          <w:b/>
+        </w:rPr>
+        <w:t>CI has nothing to train on by design</w:t>
+      </w:r>
+      <w:r>
+        <w:t>, and the fixtures are what make the code verifiable by a machine that is not permitted to see the data.</w:t>
+      </w:r>
+    </w:p>
+    <w:p>
+      <w:r>
+        <w:rPr>
+          <w:b/>
+        </w:rPr>
+        <w:t>Three tests worth singling out</w:t>
+      </w:r>
+      <w:r>
+        <w:t>, because they assert properties rather than return values:</w:t>
+      </w:r>
+    </w:p>
+    <w:p>
+      <w:pPr>
+        <w:pStyle w:val="ListBullet"/>
+      </w:pPr>
+      <w:r>
+        <w:rPr>
+          <w:rFonts w:ascii="Consolas" w:hAnsi="Consolas"/>
+          <w:color w:val="B03060"/>
+          <w:sz w:val="19"/>
+        </w:rPr>
+        <w:t>test_only_the_champion_is_evaluated_on_the_test_set</w:t>
+      </w:r>
+      <w:r>
+        <w:t xml:space="preserve"> — fails if </w:t>
+      </w:r>
+      <w:r>
+        <w:rPr>
+          <w:rFonts w:ascii="Consolas" w:hAnsi="Consolas"/>
+          <w:color w:val="B03060"/>
+          <w:sz w:val="19"/>
+        </w:rPr>
+        <w:t>predict(x_test)</w:t>
+      </w:r>
+      <w:r>
+        <w:t xml:space="preserve"> is</w:t>
+      </w:r>
+    </w:p>
+    <w:p>
+      <w:r>
+        <w:t>reintroduced into the candidate loop. That is how the property was lost the first time, so it is now a mechanism rather than a sentence in a report.</w:t>
+      </w:r>
+    </w:p>
+    <w:p>
+      <w:pPr>
+        <w:pStyle w:val="ListBullet"/>
+      </w:pPr>
+      <w:r>
+        <w:rPr>
+          <w:rFonts w:ascii="Consolas" w:hAnsi="Consolas"/>
+          <w:color w:val="B03060"/>
+          <w:sz w:val="19"/>
+        </w:rPr>
+        <w:t>test_exploration_works_across_separate_single_row_calls</w:t>
+      </w:r>
+      <w:r>
+        <w:t xml:space="preserve"> — the service handles </w:t>
+      </w:r>
+      <w:r>
+        <w:rPr>
+          <w:b/>
+        </w:rPr>
+        <w:t>one</w:t>
+      </w:r>
+    </w:p>
+    <w:p>
+      <w:r>
+        <w:t>campaign per request. Every earlier exploration test passed a batch, which is precisely why a bug that disabled exploration entirely for single requests survived.</w:t>
+      </w:r>
+    </w:p>
+    <w:p>
+      <w:pPr>
+        <w:pStyle w:val="ListBullet"/>
+      </w:pPr>
+      <w:r>
+        <w:rPr>
+          <w:rFonts w:ascii="Consolas" w:hAnsi="Consolas"/>
+          <w:color w:val="B03060"/>
+          <w:sz w:val="19"/>
+        </w:rPr>
+        <w:t>TestUnhandledExceptions</w:t>
+      </w:r>
+      <w:r>
+        <w:t xml:space="preserve"> — asserts a </w:t>
+      </w:r>
+      <w:r>
+        <w:rPr>
+          <w:rFonts w:ascii="Consolas" w:hAnsi="Consolas"/>
+          <w:color w:val="B03060"/>
+          <w:sz w:val="19"/>
+        </w:rPr>
+        <w:t>500</w:t>
+      </w:r>
+      <w:r>
+        <w:t xml:space="preserve"> carries </w:t>
+      </w:r>
+      <w:r>
+        <w:rPr>
+          <w:rFonts w:ascii="Consolas" w:hAnsi="Consolas"/>
+          <w:color w:val="B03060"/>
+          <w:sz w:val="19"/>
+        </w:rPr>
+        <w:t>X-Request-ID</w:t>
+      </w:r>
+      <w:r>
+        <w:t xml:space="preserve"> and does </w:t>
+      </w:r>
+      <w:r>
+        <w:rPr>
+          <w:b/>
+        </w:rPr>
+        <w:t>not</w:t>
+      </w:r>
+      <w:r>
+        <w:t xml:space="preserve"> echo the</w:t>
+      </w:r>
+    </w:p>
+    <w:p>
+      <w:r>
+        <w:t>underlying exception message. Writing it found that the correlation ID was present on every successful response and missing on exactly the responses a caller would need it for.</w:t>
+      </w:r>
+    </w:p>
+    <w:p>
+      <w:r>
+        <w:rPr>
+          <w:rFonts w:ascii="Consolas" w:hAnsi="Consolas"/>
+          <w:color w:val="B03060"/>
+          <w:sz w:val="19"/>
+        </w:rPr>
+        <w:t>src/training/train.py</w:t>
+      </w:r>
+      <w:r>
+        <w:t xml:space="preserve"> is the weakest module at </w:t>
+      </w:r>
+      <w:r>
+        <w:rPr>
+          <w:b/>
+        </w:rPr>
+        <w:t>72%</w:t>
+      </w:r>
+      <w:r>
+        <w:t xml:space="preserve">: the untested paths are the calibration branch and MLflow logging, which need a full training run rather than the </w:t>
+      </w:r>
+      <w:r>
+        <w:rPr>
+          <w:rFonts w:ascii="Consolas" w:hAnsi="Consolas"/>
+          <w:color w:val="B03060"/>
+          <w:sz w:val="19"/>
+        </w:rPr>
+        <w:t>--fast</w:t>
+      </w:r>
+      <w:r>
+        <w:t xml:space="preserve"> smoke runs the suite uses. It is included in the measurement — an earlier version excluded it, which made the headline number flattering.</w:t>
       </w:r>
     </w:p>
     <w:p>
@@ -31019,11 +34225,57 @@
             </w:r>
             <w:r>
               <w:rPr>
+                <w:b/>
+                <w:sz w:val="18"/>
+              </w:rPr>
+              <w:t>`false`</w:t>
+            </w:r>
+          </w:p>
+        </w:tc>
+        <w:tc>
+          <w:tcPr>
+            <w:tcW w:type="dxa" w:w="2880"/>
+          </w:tcPr>
+          <w:p>
+            <w:r>
+              <w:rPr>
+                <w:sz w:val="18"/>
+              </w:rPr>
+            </w:r>
+            <w:r>
+              <w:rPr>
+                <w:b/>
+                <w:sz w:val="18"/>
+              </w:rPr>
+              <w:t>Fail closed.</w:t>
+            </w:r>
+            <w:r>
+              <w:rPr>
+                <w:sz w:val="18"/>
+              </w:rPr>
+              <w:t xml:space="preserve"> See below</w:t>
+            </w:r>
+          </w:p>
+        </w:tc>
+      </w:tr>
+      <w:tr>
+        <w:tc>
+          <w:tcPr>
+            <w:tcW w:type="dxa" w:w="2880"/>
+          </w:tcPr>
+          <w:p>
+            <w:r>
+              <w:rPr>
+                <w:sz w:val="18"/>
+              </w:rPr>
+            </w:r>
+            <w:r>
+              <w:rPr>
                 <w:rFonts w:ascii="Consolas" w:hAnsi="Consolas"/>
                 <w:color w:val="B03060"/>
                 <w:sz w:val="18"/>
               </w:rPr>
-              <w:t>true</w:t>
+              <w:t>AUTOMATION_CONFIDENCE_THRESHOLD</w:t>
             </w:r>
           </w:p>
         </w:tc>
@@ -31036,12 +34288,6 @@
               <w:rPr>
                 <w:sz w:val="18"/>
               </w:rPr>
-            </w:r>
-            <w:r>
-              <w:rPr>
-                <w:sz w:val="18"/>
-              </w:rPr>
-              <w:t xml:space="preserve">Degrade to baseline instead of failing. Set </w:t>
             </w:r>
             <w:r>
               <w:rPr>
@@ -31049,13 +34295,44 @@
                 <w:color w:val="B03060"/>
                 <w:sz w:val="18"/>
               </w:rPr>
-              <w:t>false</w:t>
-            </w:r>
-            <w:r>
-              <w:rPr>
-                <w:sz w:val="18"/>
-              </w:rPr>
-              <w:t xml:space="preserve"> in production.</w:t>
+              <w:t>0.0</w:t>
+            </w:r>
+            <w:r>
+              <w:rPr>
+                <w:sz w:val="18"/>
+              </w:rPr>
+              <w:t xml:space="preserve"> (disabled)</w:t>
+            </w:r>
+          </w:p>
+        </w:tc>
+        <w:tc>
+          <w:tcPr>
+            <w:tcW w:type="dxa" w:w="2880"/>
+          </w:tcPr>
+          <w:p>
+            <w:r>
+              <w:rPr>
+                <w:sz w:val="18"/>
+              </w:rPr>
+            </w:r>
+            <w:r>
+              <w:rPr>
+                <w:sz w:val="18"/>
+              </w:rPr>
+              <w:t xml:space="preserve">Minimum probability to decide automatically. </w:t>
+            </w:r>
+            <w:r>
+              <w:rPr>
+                <w:b/>
+                <w:sz w:val="18"/>
+              </w:rPr>
+              <w:t>Set to `0.60` in deployment</w:t>
+            </w:r>
+            <w:r>
+              <w:rPr>
+                <w:sz w:val="18"/>
+              </w:rPr>
+              <w:t xml:space="preserve"> — a fitted parameter, not a constant</w:t>
             </w:r>
           </w:p>
         </w:tc>
@@ -31077,7 +34354,7 @@
                 <w:color w:val="B03060"/>
                 <w:sz w:val="18"/>
               </w:rPr>
-              <w:t>LOG_LEVEL</w:t>
+              <w:t>EXPLORATION_RATE</w:t>
             </w:r>
           </w:p>
         </w:tc>
@@ -31097,6 +34374,132 @@
                 <w:color w:val="B03060"/>
                 <w:sz w:val="18"/>
               </w:rPr>
+              <w:t>0.0</w:t>
+            </w:r>
+            <w:r>
+              <w:rPr>
+                <w:sz w:val="18"/>
+              </w:rPr>
+              <w:t xml:space="preserve"> (off)</w:t>
+            </w:r>
+          </w:p>
+        </w:tc>
+        <w:tc>
+          <w:tcPr>
+            <w:tcW w:type="dxa" w:w="2880"/>
+          </w:tcPr>
+          <w:p>
+            <w:r>
+              <w:rPr>
+                <w:sz w:val="18"/>
+              </w:rPr>
+            </w:r>
+            <w:r>
+              <w:rPr>
+                <w:sz w:val="18"/>
+              </w:rPr>
+              <w:t>Fraction of decline recommendations overridden so outcomes stay observable</w:t>
+            </w:r>
+          </w:p>
+        </w:tc>
+      </w:tr>
+      <w:tr>
+        <w:tc>
+          <w:tcPr>
+            <w:tcW w:type="dxa" w:w="2880"/>
+          </w:tcPr>
+          <w:p>
+            <w:r>
+              <w:rPr>
+                <w:sz w:val="18"/>
+              </w:rPr>
+            </w:r>
+            <w:r>
+              <w:rPr>
+                <w:rFonts w:ascii="Consolas" w:hAnsi="Consolas"/>
+                <w:color w:val="B03060"/>
+                <w:sz w:val="18"/>
+              </w:rPr>
+              <w:t>ENABLE_DECISION_LAYER</w:t>
+            </w:r>
+          </w:p>
+        </w:tc>
+        <w:tc>
+          <w:tcPr>
+            <w:tcW w:type="dxa" w:w="2880"/>
+          </w:tcPr>
+          <w:p>
+            <w:r>
+              <w:rPr>
+                <w:sz w:val="18"/>
+              </w:rPr>
+            </w:r>
+            <w:r>
+              <w:rPr>
+                <w:rFonts w:ascii="Consolas" w:hAnsi="Consolas"/>
+                <w:color w:val="B03060"/>
+                <w:sz w:val="18"/>
+              </w:rPr>
+              <w:t>true</w:t>
+            </w:r>
+          </w:p>
+        </w:tc>
+        <w:tc>
+          <w:tcPr>
+            <w:tcW w:type="dxa" w:w="2880"/>
+          </w:tcPr>
+          <w:p>
+            <w:r>
+              <w:rPr>
+                <w:sz w:val="18"/>
+              </w:rPr>
+            </w:r>
+            <w:r>
+              <w:rPr>
+                <w:sz w:val="18"/>
+              </w:rPr>
+              <w:t>Attach the cost-sensitive recommendation</w:t>
+            </w:r>
+          </w:p>
+        </w:tc>
+      </w:tr>
+      <w:tr>
+        <w:tc>
+          <w:tcPr>
+            <w:tcW w:type="dxa" w:w="2880"/>
+          </w:tcPr>
+          <w:p>
+            <w:r>
+              <w:rPr>
+                <w:sz w:val="18"/>
+              </w:rPr>
+            </w:r>
+            <w:r>
+              <w:rPr>
+                <w:rFonts w:ascii="Consolas" w:hAnsi="Consolas"/>
+                <w:color w:val="B03060"/>
+                <w:sz w:val="18"/>
+              </w:rPr>
+              <w:t>LOG_LEVEL</w:t>
+            </w:r>
+          </w:p>
+        </w:tc>
+        <w:tc>
+          <w:tcPr>
+            <w:tcW w:type="dxa" w:w="2880"/>
+          </w:tcPr>
+          <w:p>
+            <w:r>
+              <w:rPr>
+                <w:sz w:val="18"/>
+              </w:rPr>
+            </w:r>
+            <w:r>
+              <w:rPr>
+                <w:rFonts w:ascii="Consolas" w:hAnsi="Consolas"/>
+                <w:color w:val="B03060"/>
+                <w:sz w:val="18"/>
+              </w:rPr>
               <w:t>INFO</w:t>
             </w:r>
           </w:p>
@@ -31116,6 +34519,146 @@
                 <w:sz w:val="18"/>
               </w:rPr>
               <w:t>Logging verbosity</w:t>
+            </w:r>
+          </w:p>
+        </w:tc>
+      </w:tr>
+      <w:tr>
+        <w:tc>
+          <w:tcPr>
+            <w:tcW w:type="dxa" w:w="2880"/>
+          </w:tcPr>
+          <w:p>
+            <w:r>
+              <w:rPr>
+                <w:sz w:val="18"/>
+              </w:rPr>
+            </w:r>
+            <w:r>
+              <w:rPr>
+                <w:rFonts w:ascii="Consolas" w:hAnsi="Consolas"/>
+                <w:color w:val="B03060"/>
+                <w:sz w:val="18"/>
+              </w:rPr>
+              <w:t>JSON_LOGS</w:t>
+            </w:r>
+          </w:p>
+        </w:tc>
+        <w:tc>
+          <w:tcPr>
+            <w:tcW w:type="dxa" w:w="2880"/>
+          </w:tcPr>
+          <w:p>
+            <w:r>
+              <w:rPr>
+                <w:sz w:val="18"/>
+              </w:rPr>
+            </w:r>
+            <w:r>
+              <w:rPr>
+                <w:sz w:val="18"/>
+              </w:rPr>
+              <w:t>auto</w:t>
+            </w:r>
+          </w:p>
+        </w:tc>
+        <w:tc>
+          <w:tcPr>
+            <w:tcW w:type="dxa" w:w="2880"/>
+          </w:tcPr>
+          <w:p>
+            <w:r>
+              <w:rPr>
+                <w:sz w:val="18"/>
+              </w:rPr>
+            </w:r>
+            <w:r>
+              <w:rPr>
+                <w:sz w:val="18"/>
+              </w:rPr>
+              <w:t xml:space="preserve">Structured JSON on Cloud Run (via </w:t>
+            </w:r>
+            <w:r>
+              <w:rPr>
+                <w:rFonts w:ascii="Consolas" w:hAnsi="Consolas"/>
+                <w:color w:val="B03060"/>
+                <w:sz w:val="18"/>
+              </w:rPr>
+              <w:t>K_SERVICE</w:t>
+            </w:r>
+            <w:r>
+              <w:rPr>
+                <w:sz w:val="18"/>
+              </w:rPr>
+              <w:t>), plain text locally</w:t>
+            </w:r>
+          </w:p>
+        </w:tc>
+      </w:tr>
+      <w:tr>
+        <w:tc>
+          <w:tcPr>
+            <w:tcW w:type="dxa" w:w="2880"/>
+          </w:tcPr>
+          <w:p>
+            <w:r>
+              <w:rPr>
+                <w:sz w:val="18"/>
+              </w:rPr>
+            </w:r>
+            <w:r>
+              <w:rPr>
+                <w:rFonts w:ascii="Consolas" w:hAnsi="Consolas"/>
+                <w:color w:val="B03060"/>
+                <w:sz w:val="18"/>
+              </w:rPr>
+              <w:t>ALLOWED_ORIGINS</w:t>
+            </w:r>
+          </w:p>
+        </w:tc>
+        <w:tc>
+          <w:tcPr>
+            <w:tcW w:type="dxa" w:w="2880"/>
+          </w:tcPr>
+          <w:p>
+            <w:r>
+              <w:rPr>
+                <w:sz w:val="18"/>
+              </w:rPr>
+            </w:r>
+            <w:r>
+              <w:rPr>
+                <w:rFonts w:ascii="Consolas" w:hAnsi="Consolas"/>
+                <w:color w:val="B03060"/>
+                <w:sz w:val="18"/>
+              </w:rPr>
+              <w:t>*</w:t>
+            </w:r>
+          </w:p>
+        </w:tc>
+        <w:tc>
+          <w:tcPr>
+            <w:tcW w:type="dxa" w:w="2880"/>
+          </w:tcPr>
+          <w:p>
+            <w:r>
+              <w:rPr>
+                <w:sz w:val="18"/>
+              </w:rPr>
+            </w:r>
+            <w:r>
+              <w:rPr>
+                <w:sz w:val="18"/>
+              </w:rPr>
+              <w:t xml:space="preserve">CORS. Credentials are disabled while this is </w:t>
+            </w:r>
+            <w:r>
+              <w:rPr>
+                <w:rFonts w:ascii="Consolas" w:hAnsi="Consolas"/>
+                <w:color w:val="B03060"/>
+                <w:sz w:val="18"/>
+              </w:rPr>
+              <w:t>*</w:t>
             </w:r>
           </w:p>
         </w:tc>
@@ -31183,6 +34726,164 @@
     </w:tbl>
     <w:p/>
     <w:p>
+      <w:r>
+        <w:rPr>
+          <w:b/>
+        </w:rPr>
+        <w:t>Three defaults are deliberately conservative, and each is a decision rather than a convention:</w:t>
+      </w:r>
+    </w:p>
+    <w:p>
+      <w:r>
+        <w:rPr>
+          <w:rFonts w:ascii="Consolas" w:hAnsi="Consolas"/>
+          <w:color w:val="B03060"/>
+          <w:sz w:val="19"/>
+        </w:rPr>
+        <w:t>ALLOW_BASELINE_FALLBACK=false</w:t>
+      </w:r>
+      <w:r>
+        <w:t xml:space="preserve"> — a missing or unreadable artifact prevents startup rather than degrading to the majority-class baseline. This default was </w:t>
+      </w:r>
+      <w:r>
+        <w:rPr>
+          <w:b/>
+        </w:rPr>
+        <w:t>changed</w:t>
+      </w:r>
+      <w:r>
+        <w:t xml:space="preserve"> after the deployed service was found serving the baseline through three consecutive "successful" deploys: a malformed </w:t>
+      </w:r>
+      <w:r>
+        <w:rPr>
+          <w:rFonts w:ascii="Consolas" w:hAnsi="Consolas"/>
+          <w:color w:val="B03060"/>
+          <w:sz w:val="19"/>
+        </w:rPr>
+        <w:t>--set-env-vars</w:t>
+      </w:r>
+      <w:r>
+        <w:t xml:space="preserve"> argument folded two variables into one, </w:t>
+      </w:r>
+      <w:r>
+        <w:rPr>
+          <w:rFonts w:ascii="Consolas" w:hAnsi="Consolas"/>
+          <w:color w:val="B03060"/>
+          <w:sz w:val="19"/>
+        </w:rPr>
+        <w:t>MODEL_PATH</w:t>
+      </w:r>
+      <w:r>
+        <w:t xml:space="preserve"> pointed at a path that did not exist, and a permissive default let the container start anyway and return confident majority-class predictions. </w:t>
+      </w:r>
+      <w:r>
+        <w:rPr>
+          <w:i/>
+        </w:rPr>
+        <w:t>A fallback that engages by default converts a loud failure into a quiet wrong answer.</w:t>
+      </w:r>
+      <w:r>
+        <w:t xml:space="preserve"> Local development and CI set it </w:t>
+      </w:r>
+      <w:r>
+        <w:rPr>
+          <w:rFonts w:ascii="Consolas" w:hAnsi="Consolas"/>
+          <w:color w:val="B03060"/>
+          <w:sz w:val="19"/>
+        </w:rPr>
+        <w:t>true</w:t>
+      </w:r>
+      <w:r>
+        <w:t xml:space="preserve"> explicitly, because neither has a trained model.</w:t>
+      </w:r>
+    </w:p>
+    <w:p>
+      <w:r>
+        <w:rPr>
+          <w:rFonts w:ascii="Consolas" w:hAnsi="Consolas"/>
+          <w:color w:val="B03060"/>
+          <w:sz w:val="19"/>
+        </w:rPr>
+        <w:t>AUTOMATION_CONFIDENCE_THRESHOLD=0.0</w:t>
+      </w:r>
+      <w:r>
+        <w:t xml:space="preserve"> — the gate is </w:t>
+      </w:r>
+      <w:r>
+        <w:rPr>
+          <w:b/>
+        </w:rPr>
+        <w:t>off</w:t>
+      </w:r>
+      <w:r>
+        <w:t xml:space="preserve"> in code. 0.60 is a </w:t>
+      </w:r>
+      <w:r>
+        <w:rPr>
+          <w:i/>
+        </w:rPr>
+        <w:t>fitted parameter</w:t>
+      </w:r>
+      <w:r>
+        <w:t xml:space="preserve"> selected on the calibration split for one specific artifact; hard-coding it here would silently apply one model's operating point to a different model. The deployment sets it, and it must be re-derived from </w:t>
+      </w:r>
+      <w:r>
+        <w:rPr>
+          <w:rFonts w:ascii="Consolas" w:hAnsi="Consolas"/>
+          <w:color w:val="B03060"/>
+          <w:sz w:val="19"/>
+        </w:rPr>
+        <w:t>findings.json["automation_gate"]["threshold"]</w:t>
+      </w:r>
+      <w:r>
+        <w:t xml:space="preserve"> after every retrain.</w:t>
+      </w:r>
+    </w:p>
+    <w:p>
+      <w:r>
+        <w:rPr>
+          <w:rFonts w:ascii="Consolas" w:hAnsi="Consolas"/>
+          <w:color w:val="B03060"/>
+          <w:sz w:val="19"/>
+        </w:rPr>
+        <w:t>EXPLORATION_RATE=0.0</w:t>
+      </w:r>
+      <w:r>
+        <w:t xml:space="preserve"> — exploration spends real budget on knowingly sub-optimal campaigns. That can be an excellent investment, but shipping </w:t>
+      </w:r>
+      <w:r>
+        <w:rPr>
+          <w:rFonts w:ascii="Consolas" w:hAnsi="Consolas"/>
+          <w:color w:val="B03060"/>
+          <w:sz w:val="19"/>
+        </w:rPr>
+        <w:t>0.05</w:t>
+      </w:r>
+      <w:r>
+        <w:t xml:space="preserve"> would quietly commit a marketing team to misallocating one campaign in twenty. It is a required, explicit input; see </w:t>
+      </w:r>
+      <w:r>
+        <w:rPr>
+          <w:rFonts w:ascii="Consolas" w:hAnsi="Consolas"/>
+          <w:color w:val="B03060"/>
+          <w:sz w:val="19"/>
+        </w:rPr>
+        <w:t>docs/validation_plan.md</w:t>
+      </w:r>
+      <w:r>
+        <w:t xml:space="preserve"> §5.1 for the trade-off. Note that inverse-propensity evaluation is </w:t>
+      </w:r>
+      <w:r>
+        <w:rPr>
+          <w:b/>
+        </w:rPr>
+        <w:t>undefined</w:t>
+      </w:r>
+      <w:r>
+        <w:t xml:space="preserve"> at zero, so this must be set before offline policy evaluation is possible.</w:t>
+      </w:r>
+    </w:p>
+    <w:p>
       <w:pPr>
         <w:pStyle w:val="Heading3"/>
       </w:pPr>
@@ -31249,15 +34950,24 @@
         <w:rPr>
           <w:b/>
         </w:rPr>
-        <w:t>53.8% of predictions flip when the two groups are swapped.</w:t>
-      </w:r>
-      <w:r>
-        <w:t xml:space="preserve"> The positions are genuinely</w:t>
-      </w:r>
-    </w:p>
-    <w:p>
-      <w:r>
-        <w:t>not exchangeable, so using position is legitimate, but the model leans on it heavily and will degrade silently if the upstream convention for assigning "group 1" ever changes.</w:t>
+        <w:t>53.8% of predictions FAIL to transform correctly when the two groups are swapped.</w:t>
+      </w:r>
+      <w:r>
+        <w:t xml:space="preserve"> Note</w:t>
+      </w:r>
+    </w:p>
+    <w:p>
+      <w:r>
+        <w:t xml:space="preserve">the direction: the symmetry requires 0→0, 1→2, 2→1, so for classes 1 and 2 </w:t>
+      </w:r>
+      <w:r>
+        <w:rPr>
+          <w:i/>
+        </w:rPr>
+        <w:t>changing is correct</w:t>
+      </w:r>
+      <w:r>
+        <w:t xml:space="preserve"> and staying the same is the violation. The positions are genuinely not exchangeable, so using position is legitimate, but the model leans on it heavily and will degrade silently if the upstream convention for assigning "group 1" ever changes.</w:t>
       </w:r>
     </w:p>
     <w:p>

</xml_diff>